<commit_message>
Add measured Jetson validation and revise preprint
</commit_message>
<xml_diff>
--- a/paper/Edge_Litter_Detection_Preprint.docx
+++ b/paper/Edge_Litter_Detection_Preprint.docx
@@ -15,7 +15,7 @@
           <w:sz w:val="48"/>
           <w:szCs w:val="48"/>
         </w:rPr>
-        <w:t xml:space="preserve">An Open and Reproducible Edge-AI System for Litter Detection, Multiclass Classification, Tracking, and Counting</w:t>
+        <w:t xml:space="preserve">An Open and Reproducible Edge-AI Software Architecture for Litter Detection, Multiclass Classification, Tracking, and Counting</w:t>
       </w:r>
     </w:p>
     <w:p>
@@ -29,7 +29,7 @@
           <w:sz w:val="28"/>
           <w:szCs w:val="28"/>
         </w:rPr>
-        <w:t xml:space="preserve">Systems and reproducibility preprint — verified software evidence and preliminary engineering validation</w:t>
+        <w:t xml:space="preserve">Software architecture and reproducibility preprint — preliminary engineering and Jetson validation</w:t>
       </w:r>
     </w:p>
     <w:p>
@@ -114,7 +114,7 @@
         <w:spacing w:after="120"/>
       </w:pPr>
       <w:r>
-        <w:t xml:space="preserve">Litter monitoring is often treated as an object-detection exercise, although a deployable solution must also ingest operational video, maintain stable class contracts, avoid repeated counting, persist evidence, support human review, and integrate safely with collection or sorting workflows. This paper presents an open and reproducible edge-AI system that addresses those requirements as one portable application. The software accepts attached cameras, images, recorded video, HTTP media, and RTSP streams. It normalizes public or custom detector output into a common schema, applies duplicate suppression and class-stabilized tracking, reports visible and unique-session counts, and stores run evidence in SQLite and JSON. A browser interface exposes annotated video, counts, review tasks, and source controls. The default operational taxonomy contains 16 litter categories and can map uncertain or hazardous items to human review and site-specific separation guidance. The detector is an interchangeable component rather than the product boundary: the current clean-clone workflow uses the public OmDet-Turbo Tiny open-vocabulary model, while a litter-specific RF-DETR checkpoint may be trained and published later if representative evaluation shows that adaptation is required. Preliminary engineering validation confirms installation, real inference, persistence, application tests, and model-only execution on NVIDIA CUDA and Apple silicon. On an AWS g4dn.xlarge with a Tesla T4, a repeated-image OmDet-Turbo benchmark measured 16.53 frames per second, 58.98 ms mean detector latency, 61.03 ms p95 latency, and 0.55 GiB peak allocated GPU memory. These measurements do not establish target-domain accuracy, full-pipeline sustained performance, or Jetson and AMD deployment performance. The paper therefore contributes a reusable system, explicit count semantics, a safety and security boundary, and a predeclared evaluation protocol while clearly separating verified software evidence from pending empirical claims.</w:t>
+        <w:t xml:space="preserve">Litter monitoring is often treated as an object-detection exercise, although a deployable solution must also ingest operational video, maintain stable class contracts, avoid repeated counting, persist evidence, support human review, and integrate safely with collection or sorting workflows. This paper presents an open and reproducible edge-AI system that addresses those requirements as one portable application. The software accepts attached cameras, images, recorded video, HTTP media, and RTSP streams. It normalizes public or custom detector output into a common schema, applies duplicate suppression and class-stabilized tracking, reports visible and unique-session counts, and stores run evidence in SQLite and JSON. A browser interface exposes annotated video, counts, review tasks, and source controls. The default operational taxonomy contains 16 litter categories and can map uncertain or hazardous items to human review and site-specific separation guidance. The detector is an interchangeable component rather than the product boundary: the current clean-clone workflow uses the public OmDet-Turbo Tiny open-vocabulary model, while a litter-specific RF-DETR checkpoint may be trained and published later if representative evaluation shows that adaptation is required. Preliminary engineering validation confirms installation, real inference, persistence, application tests, and execution on NVIDIA CUDA, Apple silicon, and the intended Jetson Orin Nano 8 GB. On an AWS g4dn.xlarge with a Tesla T4, a repeated-image OmDet-Turbo benchmark measured 16.53 frames per second, 58.98 ms mean detector latency, 61.03 ms p95 latency, and 0.55 GiB peak allocated GPU memory. In a coexistence test on the 8 GB Jetson, the same public-model path measured 5.54 detector frames per second and 4.94 frames per second through all 3,622 frames of a video, tracking, annotation, JSONL, and SQLite workflow; the 733.54-second processing run reached 66.31 °C and 15.81 W peak whole-board input power. The Jetson workflow, dashboard, and counts API completed, but the provisional 15 FPS target was not met. These measurements do not establish target-domain accuracy, count error, endurance, AMD deployment performance, or production readiness. The paper therefore contributes a reusable system, explicit count semantics, a safety and security boundary, and a predeclared evaluation protocol while clearly separating verified software evidence from pending empirical claims.</w:t>
       </w:r>
     </w:p>
     <w:p>
@@ -170,6 +170,14 @@
         <w:spacing w:after="120"/>
       </w:pPr>
       <w:r>
+        <w:t xml:space="preserve">The contribution is therefore a software-systems and reproducibility architecture, not a claim that a new detector or a validated accuracy result is presented. Until labeled target-domain results are available, the system should be judged by the completeness and reproducibility of its implemented workflow, not by unreported model quality.</w:t>
+      </w:r>
+    </w:p>
+    <w:p>
+      <w:pPr>
+        <w:spacing w:after="120"/>
+      </w:pPr>
+      <w:r>
         <w:t xml:space="preserve">The result is the open-source Edge Litter Detection application [7]. A user can clone the repository and run one launcher that prepares an isolated environment, installs dependencies, downloads a pinned public model, discovers or accepts a source, performs inference, and writes durable evidence. The same application supports a local dashboard, a private HTTP API, SQLite queries, human review, and integration events for a larger vehicle or facility system.</w:t>
       </w:r>
     </w:p>
@@ -178,7 +186,7 @@
         <w:spacing w:after="120"/>
       </w:pPr>
       <w:r>
-        <w:t xml:space="preserve">This paper is released as a systems and reproducibility preprint. It documents the implemented design and preliminary technical evidence while the target-domain dataset and target-device acceptance tests are pending. This distinction is deliberate: model detections on demonstration media are functional evidence, not accuracy evidence, and a model-only accelerator benchmark is not proof of sustained camera performance.</w:t>
+        <w:t xml:space="preserve">This paper is released as a systems and reproducibility preprint. It documents the implemented design, preliminary technical evidence, and one authorized Jetson coexistence run while the target-domain dataset, repeated device tests, and multi-hour endurance acceptance remain pending. This distinction is deliberate: model detections on demonstration media are functional evidence, not accuracy evidence, and a short technical run is not proof of sustained camera or field performance.</w:t>
       </w:r>
     </w:p>
     <w:p>
@@ -571,6 +579,30 @@
       </w:pPr>
       <w:r>
         <w:t xml:space="preserve">The reproducibility gap is often caused by missing model revisions, thresholds, environment versions, hardware details, or test-media checksums. This project records run metadata and emits machine-readable evidence so results can be connected to a source, model, configuration, device, and Git revision.</w:t>
+      </w:r>
+    </w:p>
+    <w:p>
+      <w:pPr>
+        <w:pStyle w:val="Heading2"/>
+      </w:pPr>
+      <w:r>
+        <w:t xml:space="preserve">2.5 Integrated litter and sorting systems</w:t>
+      </w:r>
+    </w:p>
+    <w:p>
+      <w:pPr>
+        <w:spacing w:after="120"/>
+      </w:pPr>
+      <w:r>
+        <w:t xml:space="preserve">Existing integrated platforms illustrate that operational value extends beyond one detector metric. Litterati combines mobile image collection, mapping, and analytics for identifying litter patterns and evaluating interventions [22]. The US Environmental Protection Agency describes TrashBot as a machine-learning system that sorts material at the point of disposal and provides disposal guidance [23]. AMP Vision applies continuous material identification and analytics inside material-recovery facilities [24].</w:t>
+      </w:r>
+    </w:p>
+    <w:p>
+      <w:pPr>
+        <w:spacing w:after="120"/>
+      </w:pPr>
+      <w:r>
+        <w:t xml:space="preserve">These examples occupy different product boundaries: community and municipal measurement, smart disposal, and industrial recovery. The present work does not claim equivalent deployment maturity. Its narrower contribution is an open, locally deployable perception-and-evidence component with explicit count semantics, model interchangeability, offline persistence, and a machinery safety boundary that can be integrated into a larger cleanup or sorting solution.</w:t>
       </w:r>
     </w:p>
     <w:p>
@@ -2149,131 +2181,7 @@
         <w:spacing w:after="120"/>
       </w:pPr>
       <w:r>
-        <w:t xml:space="preserve">The taxonomy is not a claim that every material can be visually identified. Low-confidence, hazardous, and ambiguous observations can enter a human review queue. If a released closed-set checkpoint is trained later, every advertised class must have documented training and held-out evaluation support.</w:t>
-      </w:r>
-    </w:p>
-    <w:p>
-      <w:pPr>
-        <w:pStyle w:val="Heading2"/>
-      </w:pPr>
-      <w:r>
-        <w:t xml:space="preserve">4.3 Tracking and count semantics</w:t>
-      </w:r>
-    </w:p>
-    <w:p>
-      <w:pPr>
-        <w:spacing w:after="120"/>
-      </w:pPr>
-      <w:r>
-        <w:t xml:space="preserve">The system deliberately reports different quantities:</w:t>
-      </w:r>
-    </w:p>
-    <w:p>
-      <w:pPr>
-        <w:pStyle w:val="ListParagraph"/>
-        <w:numPr>
-          <w:ilvl w:val="0"/>
-          <w:numId w:val="2"/>
-        </w:numPr>
-        <w:spacing w:after="60"/>
-      </w:pPr>
-      <w:r>
-        <w:t xml:space="preserve">visible_counts are detections present in the current frame;</w:t>
-      </w:r>
-    </w:p>
-    <w:p>
-      <w:pPr>
-        <w:pStyle w:val="ListParagraph"/>
-        <w:numPr>
-          <w:ilvl w:val="0"/>
-          <w:numId w:val="2"/>
-        </w:numPr>
-        <w:spacing w:after="60"/>
-      </w:pPr>
-      <w:r>
-        <w:t xml:space="preserve">confirmed_visible_counts are currently visible detections whose tracks</w:t>
-      </w:r>
-    </w:p>
-    <w:p>
-      <w:pPr>
-        <w:spacing w:after="120"/>
-      </w:pPr>
-      <w:r>
-        <w:t xml:space="preserve">have met a confirmation threshold;</w:t>
-      </w:r>
-    </w:p>
-    <w:p>
-      <w:pPr>
-        <w:pStyle w:val="ListParagraph"/>
-        <w:numPr>
-          <w:ilvl w:val="0"/>
-          <w:numId w:val="2"/>
-        </w:numPr>
-        <w:spacing w:after="60"/>
-      </w:pPr>
-      <w:r>
-        <w:t xml:space="preserve">unique_session_counts are confirmed track identities counted once in one</w:t>
-      </w:r>
-    </w:p>
-    <w:p>
-      <w:pPr>
-        <w:spacing w:after="120"/>
-      </w:pPr>
-      <w:r>
-        <w:t xml:space="preserve">run; and</w:t>
-      </w:r>
-    </w:p>
-    <w:p>
-      <w:pPr>
-        <w:pStyle w:val="ListParagraph"/>
-        <w:numPr>
-          <w:ilvl w:val="0"/>
-          <w:numId w:val="2"/>
-        </w:numPr>
-        <w:spacing w:after="60"/>
-      </w:pPr>
-      <w:r>
-        <w:t xml:space="preserve">confirmed_collected_counts are physical pickups separately confirmed by a</w:t>
-      </w:r>
-    </w:p>
-    <w:p>
-      <w:pPr>
-        <w:spacing w:after="120"/>
-      </w:pPr>
-      <w:r>
-        <w:t xml:space="preserve">human, collection controller, sensor-fusion service, or reviewed import.</w:t>
-      </w:r>
-    </w:p>
-    <w:p>
-      <w:pPr>
-        <w:spacing w:after="120"/>
-      </w:pPr>
-      <w:r>
-        <w:t xml:space="preserve">These quantities answer different questions. Visible counts estimate the current scene. Unique-session counts estimate how many track identities were encountered during a run. Confirmed-collected counts represent an external outcome. A detection does not prove collection, and unique counts from different runs cannot be added without accepting possible duplicate physical objects.</w:t>
-      </w:r>
-    </w:p>
-    <w:p>
-      <w:pPr>
-        <w:spacing w:after="120"/>
-      </w:pPr>
-      <w:r>
-        <w:t xml:space="preserve">The default tracker associates boxes by overlap, retains a track across short missed intervals, confirms it after repeated observations, and stabilizes the class using accumulated votes. This reduces frame-by-frame overcounting and label flicker while preserving a dependency-light edge path. For fast-moving vehicle footage or crowded sorting lines, the same detection and event schema can support a stronger tracker or geospatial deduplication after separate validation.</w:t>
-      </w:r>
-    </w:p>
-    <w:p>
-      <w:pPr>
-        <w:pStyle w:val="Heading2"/>
-      </w:pPr>
-      <w:r>
-        <w:t xml:space="preserve">4.4 Persistence and offline operation</w:t>
-      </w:r>
-    </w:p>
-    <w:p>
-      <w:pPr>
-        <w:spacing w:after="120"/>
-      </w:pPr>
-      <w:r>
-        <w:t xml:space="preserve">The application writes streaming JSON Lines events, an end-of-run JSON summary, optional annotated media, and a SQLite operational database. SQLite uses write-ahead logging and parameterized statements. The schema includes:</w:t>
+        <w:t xml:space="preserve">The categories were selected by three practical criteria rather than by an attempt to reproduce one dataset ontology:</w:t>
       </w:r>
     </w:p>
     <w:tbl>
@@ -2320,7 +2228,7 @@
                 <w:sz w:val="20"/>
                 <w:szCs w:val="20"/>
               </w:rPr>
-              <w:t xml:space="preserve">Table</w:t>
+              <w:t xml:space="preserve">Criterion</w:t>
             </w:r>
           </w:p>
         </w:tc>
@@ -2351,7 +2259,7 @@
                 <w:sz w:val="20"/>
                 <w:szCs w:val="20"/>
               </w:rPr>
-              <w:t xml:space="preserve">Purpose</w:t>
+              <w:t xml:space="preserve">Classes or design response</w:t>
             </w:r>
           </w:p>
         </w:tc>
@@ -2380,7 +2288,7 @@
                 <w:sz w:val="20"/>
                 <w:szCs w:val="20"/>
               </w:rPr>
-              <w:t xml:space="preserve">runs</w:t>
+              <w:t xml:space="preserve">Common, visually promptable containers and fibers</w:t>
             </w:r>
           </w:p>
         </w:tc>
@@ -2407,7 +2315,7 @@
                 <w:sz w:val="20"/>
                 <w:szCs w:val="20"/>
               </w:rPr>
-              <w:t xml:space="preserve">source, device, vehicle, route, status, timing, and final counts</w:t>
+              <w:t xml:space="preserve">plastic bottle, glass bottle, metal can, paper, cardboard</w:t>
             </w:r>
           </w:p>
         </w:tc>
@@ -2436,7 +2344,7 @@
                 <w:sz w:val="20"/>
                 <w:szCs w:val="20"/>
               </w:rPr>
-              <w:t xml:space="preserve">frame_observations</w:t>
+              <w:t xml:space="preserve">Flexible packaging and disposable service items</w:t>
             </w:r>
           </w:p>
         </w:tc>
@@ -2463,7 +2371,7 @@
                 <w:sz w:val="20"/>
                 <w:szCs w:val="20"/>
               </w:rPr>
-              <w:t xml:space="preserve">per-frame visible and cumulative unique counts</w:t>
+              <w:t xml:space="preserve">plastic bag, food wrapper, disposable cup</w:t>
             </w:r>
           </w:p>
         </w:tc>
@@ -2492,7 +2400,7 @@
                 <w:sz w:val="20"/>
                 <w:szCs w:val="20"/>
               </w:rPr>
-              <w:t xml:space="preserve">detections</w:t>
+              <w:t xml:space="preserve">Common small, organic, soft, or bulky litter</w:t>
             </w:r>
           </w:p>
         </w:tc>
@@ -2519,7 +2427,7 @@
                 <w:sz w:val="20"/>
                 <w:szCs w:val="20"/>
               </w:rPr>
-              <w:t xml:space="preserve">optional detailed boxes and tracks</w:t>
+              <w:t xml:space="preserve">cigarette butt, food waste, textile, tire</w:t>
             </w:r>
           </w:p>
         </w:tc>
@@ -2548,7 +2456,7 @@
                 <w:sz w:val="20"/>
                 <w:szCs w:val="20"/>
               </w:rPr>
-              <w:t xml:space="preserve">run_class_counts</w:t>
+              <w:t xml:space="preserve">Items requiring special handling</w:t>
             </w:r>
           </w:p>
         </w:tc>
@@ -2575,7 +2483,7 @@
                 <w:sz w:val="20"/>
                 <w:szCs w:val="20"/>
               </w:rPr>
-              <w:t xml:space="preserve">query-friendly final class totals</w:t>
+              <w:t xml:space="preserve">battery, electronic waste, broken glass</w:t>
             </w:r>
           </w:p>
         </w:tc>
@@ -2604,7 +2512,7 @@
                 <w:sz w:val="20"/>
                 <w:szCs w:val="20"/>
               </w:rPr>
-              <w:t xml:space="preserve">review_queue</w:t>
+              <w:t xml:space="preserve">Visual or taxonomic uncertainty</w:t>
             </w:r>
           </w:p>
         </w:tc>
@@ -2631,119 +2539,7 @@
                 <w:sz w:val="20"/>
                 <w:szCs w:val="20"/>
               </w:rPr>
-              <w:t xml:space="preserve">pending, confirmed, corrected, or rejected classifications</w:t>
-            </w:r>
-          </w:p>
-        </w:tc>
-      </w:tr>
-      <w:tr>
-        <w:tc>
-          <w:tcPr>
-            <w:tcW w:type="dxa" w:w="4680"/>
-            <w:tcBorders>
-              <w:top w:val="single" w:color="CCCCCC" w:sz="1"/>
-              <w:left w:val="single" w:color="CCCCCC" w:sz="1"/>
-              <w:bottom w:val="single" w:color="CCCCCC" w:sz="1"/>
-              <w:right w:val="single" w:color="CCCCCC" w:sz="1"/>
-            </w:tcBorders>
-            <w:tcMar>
-              <w:top w:type="dxa" w:w="40"/>
-              <w:left w:type="dxa" w:w="80"/>
-              <w:bottom w:type="dxa" w:w="40"/>
-              <w:right w:type="dxa" w:w="80"/>
-            </w:tcMar>
-          </w:tcPr>
-          <w:p>
-            <w:r>
-              <w:rPr>
-                <w:rFonts w:ascii="Arial" w:cs="Arial" w:eastAsia="Arial" w:hAnsi="Arial"/>
-                <w:sz w:val="20"/>
-                <w:szCs w:val="20"/>
-              </w:rPr>
-              <w:t xml:space="preserve">collection_confirmations</w:t>
-            </w:r>
-          </w:p>
-        </w:tc>
-        <w:tc>
-          <w:tcPr>
-            <w:tcW w:type="dxa" w:w="4680"/>
-            <w:tcBorders>
-              <w:top w:val="single" w:color="CCCCCC" w:sz="1"/>
-              <w:left w:val="single" w:color="CCCCCC" w:sz="1"/>
-              <w:bottom w:val="single" w:color="CCCCCC" w:sz="1"/>
-              <w:right w:val="single" w:color="CCCCCC" w:sz="1"/>
-            </w:tcBorders>
-            <w:tcMar>
-              <w:top w:type="dxa" w:w="40"/>
-              <w:left w:type="dxa" w:w="80"/>
-              <w:bottom w:type="dxa" w:w="40"/>
-              <w:right w:type="dxa" w:w="80"/>
-            </w:tcMar>
-          </w:tcPr>
-          <w:p>
-            <w:r>
-              <w:rPr>
-                <w:rFonts w:ascii="Arial" w:cs="Arial" w:eastAsia="Arial" w:hAnsi="Arial"/>
-                <w:sz w:val="20"/>
-                <w:szCs w:val="20"/>
-              </w:rPr>
-              <w:t xml:space="preserve">independently confirmed physical pickups</w:t>
-            </w:r>
-          </w:p>
-        </w:tc>
-      </w:tr>
-      <w:tr>
-        <w:tc>
-          <w:tcPr>
-            <w:tcW w:type="dxa" w:w="4680"/>
-            <w:tcBorders>
-              <w:top w:val="single" w:color="CCCCCC" w:sz="1"/>
-              <w:left w:val="single" w:color="CCCCCC" w:sz="1"/>
-              <w:bottom w:val="single" w:color="CCCCCC" w:sz="1"/>
-              <w:right w:val="single" w:color="CCCCCC" w:sz="1"/>
-            </w:tcBorders>
-            <w:tcMar>
-              <w:top w:type="dxa" w:w="40"/>
-              <w:left w:type="dxa" w:w="80"/>
-              <w:bottom w:type="dxa" w:w="40"/>
-              <w:right w:type="dxa" w:w="80"/>
-            </w:tcMar>
-          </w:tcPr>
-          <w:p>
-            <w:r>
-              <w:rPr>
-                <w:rFonts w:ascii="Arial" w:cs="Arial" w:eastAsia="Arial" w:hAnsi="Arial"/>
-                <w:sz w:val="20"/>
-                <w:szCs w:val="20"/>
-              </w:rPr>
-              <w:t xml:space="preserve">integration_outbox</w:t>
-            </w:r>
-          </w:p>
-        </w:tc>
-        <w:tc>
-          <w:tcPr>
-            <w:tcW w:type="dxa" w:w="4680"/>
-            <w:tcBorders>
-              <w:top w:val="single" w:color="CCCCCC" w:sz="1"/>
-              <w:left w:val="single" w:color="CCCCCC" w:sz="1"/>
-              <w:bottom w:val="single" w:color="CCCCCC" w:sz="1"/>
-              <w:right w:val="single" w:color="CCCCCC" w:sz="1"/>
-            </w:tcBorders>
-            <w:tcMar>
-              <w:top w:type="dxa" w:w="40"/>
-              <w:left w:type="dxa" w:w="80"/>
-              <w:bottom w:type="dxa" w:w="40"/>
-              <w:right w:type="dxa" w:w="80"/>
-            </w:tcMar>
-          </w:tcPr>
-          <w:p>
-            <w:r>
-              <w:rPr>
-                <w:rFonts w:ascii="Arial" w:cs="Arial" w:eastAsia="Arial" w:hAnsi="Arial"/>
-                <w:sz w:val="20"/>
-                <w:szCs w:val="20"/>
-              </w:rPr>
-              <w:t xml:space="preserve">durable events waiting for an external acknowledgement</w:t>
+              <w:t xml:space="preserve">other litter and mandatory/threshold-based human review</w:t>
             </w:r>
           </w:p>
         </w:tc>
@@ -2759,7 +2555,15 @@
         <w:spacing w:after="120"/>
       </w:pPr>
       <w:r>
-        <w:t xml:space="preserve">Detailed detection rows are disabled by default to reduce long-term storage. Operators can retain counts and summaries while applying a shorter retention period to raw or annotated media. The outbox pattern permits a vehicle to continue operating without network connectivity and forward events later through an organization-controlled authenticated transport.</w:t>
+        <w:t xml:space="preserve">For public TACO preparation, only source labels that support a defensible operational interpretation are mapped directly—for example, Drink can to metal_can and Clear plastic bottle to plastic_bottle. Remaining source categories are retained as other_litter rather than discarded or assigned a more specific material without evidence. This is an operational starting ontology; class frequency, visual confusability, and site value must still be measured before a fixed-taxonomy model is released.</w:t>
+      </w:r>
+    </w:p>
+    <w:p>
+      <w:pPr>
+        <w:spacing w:after="120"/>
+      </w:pPr>
+      <w:r>
+        <w:t xml:space="preserve">The taxonomy is not a claim that every material can be visually identified. Low-confidence, hazardous, and ambiguous observations can enter a human review queue. If a released closed-set checkpoint is trained later, every advertised class must have documented training and held-out evaluation support.</w:t>
       </w:r>
     </w:p>
     <w:p>
@@ -2767,335 +2571,15 @@
         <w:pStyle w:val="Heading2"/>
       </w:pPr>
       <w:r>
-        <w:t xml:space="preserve">4.5 Human-assisted separation</w:t>
-      </w:r>
-    </w:p>
-    <w:p>
-      <w:pPr>
-        <w:spacing w:after="120"/>
-      </w:pPr>
-      <w:r>
-        <w:t xml:space="preserve">Predicted classes can be mapped to site-specific material streams. A dashboard or external application can display the class, confidence, destination, and review state to a worker. Corrections are auditable and do not silently rewrite the original model observation.</w:t>
-      </w:r>
-    </w:p>
-    <w:p>
-      <w:pPr>
-        <w:spacing w:after="120"/>
-      </w:pPr>
-      <w:r>
-        <w:t xml:space="preserve">The separation mapping is advisory. Composite, contaminated, hazardous, or unknown material may require a manual decision. Batteries, electronic waste, broken glass, sharps, chemicals, and pressurized containers require local safety procedures beyond a visual prediction.</w:t>
-      </w:r>
-    </w:p>
-    <w:p>
-      <w:pPr>
-        <w:pStyle w:val="Heading2"/>
-      </w:pPr>
-      <w:r>
-        <w:t xml:space="preserve">4.6 Dashboard and API</w:t>
-      </w:r>
-    </w:p>
-    <w:p>
-      <w:pPr>
-        <w:spacing w:after="120"/>
-      </w:pPr>
-      <w:r>
-        <w:t xml:space="preserve">The FastAPI service provides health and readiness endpoints, image detection, stream-session control, count queries, review operations, collection confirmation, and outbox acknowledgement. It also serves a dependency-free browser dashboard. A server-side session can open a camera or file on the edge computer, avoiding the false assumption that a browser camera index refers to the remote device.</w:t>
-      </w:r>
-    </w:p>
-    <w:p>
-      <w:pPr>
-        <w:spacing w:after="120"/>
-      </w:pPr>
-      <w:r>
-        <w:t xml:space="preserve">The API binds to loopback by default and has no built-in multi-user identity system. Remote access should use an SSH tunnel or a mature authenticated gateway. The project does not recommend exposing the service directly to the public Internet.</w:t>
-      </w:r>
-    </w:p>
-    <w:p>
-      <w:pPr>
-        <w:pStyle w:val="Heading2"/>
-      </w:pPr>
-      <w:r>
-        <w:t xml:space="preserve">4.7 Machinery-safety boundary</w:t>
-      </w:r>
-    </w:p>
-    <w:p>
-      <w:pPr>
-        <w:spacing w:after="120"/>
-      </w:pPr>
-      <w:r>
-        <w:t xml:space="preserve">Perception output may inform an operator or task planner, but it must not directly move hydraulic, pneumatic, or electric equipment. A production collection arm requires an independent safety-rated controller, emergency stops, manual override, exclusion-zone and proximity sensing, arm-position and load limits, stale-signal handling, and positive pickup confirmation. If safety inputs are missing or contradictory, motion must remain inhibited.</w:t>
-      </w:r>
-    </w:p>
-    <w:p>
-      <w:pPr>
-        <w:spacing w:after="120"/>
-      </w:pPr>
-      <w:r>
-        <w:t xml:space="preserve">This boundary prevents a probabilistic class or box from becoming an unreviewed actuation command. It also preserves the difference between “an object was observed” and “an object was collected.”</w:t>
-      </w:r>
-    </w:p>
-    <w:p>
-      <w:pPr>
-        <w:pStyle w:val="Heading1"/>
-      </w:pPr>
-      <w:r>
-        <w:t xml:space="preserve">5. Implementation and Reproducibility</w:t>
-      </w:r>
-    </w:p>
-    <w:p>
-      <w:pPr>
-        <w:pStyle w:val="Heading2"/>
-      </w:pPr>
-      <w:r>
-        <w:t xml:space="preserve">5.1 Software release</w:t>
-      </w:r>
-    </w:p>
-    <w:p>
-      <w:pPr>
-        <w:spacing w:after="120"/>
-      </w:pPr>
-      <w:r>
-        <w:t xml:space="preserve">The implementation described in this preprint is Edge Litter Detection version 0.10.1 at Git commit 0624677b72cf1d16b59a335b78d9003f2b479786 [7]. Code and project documentation are released under Apache License 2.0. Model checkpoints and datasets retain their own licenses and are not relicensed by the repository.</w:t>
-      </w:r>
-    </w:p>
-    <w:p>
-      <w:pPr>
-        <w:spacing w:after="120"/>
-      </w:pPr>
-      <w:r>
-        <w:t xml:space="preserve">The primary entry point is:</w:t>
-      </w:r>
-    </w:p>
-    <w:p>
-      <w:pPr>
-        <w:spacing w:after="120"/>
-      </w:pPr>
-      <w:r>
-        <w:t xml:space="preserve">git clone https://github.com/biolababs/edge-litter-detection.git</w:t>
-      </w:r>
-      <w:r>
-        <w:br/>
-        <w:t xml:space="preserve">cd edge-litter-detection</w:t>
-      </w:r>
-      <w:r>
-        <w:br/>
-        <w:t xml:space="preserve">./startup.sh --backend omdet_turbo --demo-video --no-display</w:t>
-      </w:r>
-    </w:p>
-    <w:p>
-      <w:pPr>
-        <w:spacing w:after="120"/>
-      </w:pPr>
-      <w:r>
-        <w:t xml:space="preserve">The launcher creates or reuses a virtual environment, installs the selected runtime, downloads attributed demonstration media when requested, downloads a pinned public checkpoint, runs inference, and writes evidence. Attached cameras and network streams use the same path:</w:t>
-      </w:r>
-    </w:p>
-    <w:p>
-      <w:pPr>
-        <w:spacing w:after="120"/>
-      </w:pPr>
-      <w:r>
-        <w:t xml:space="preserve">./startup.sh --source 0 --backend omdet_turbo</w:t>
-      </w:r>
-      <w:r>
-        <w:br/>
-        <w:t xml:space="preserve"/>
-      </w:r>
-      <w:r>
-        <w:br/>
-        <w:t xml:space="preserve">export LITTER_STREAM_URL="rtsp://camera-host/live"</w:t>
-      </w:r>
-      <w:r>
-        <w:br/>
-        <w:t xml:space="preserve">./startup.sh --source "$LITTER_STREAM_URL" --backend omdet_turbo --no-display</w:t>
-      </w:r>
-    </w:p>
-    <w:p>
-      <w:pPr>
-        <w:spacing w:after="120"/>
-      </w:pPr>
-      <w:r>
-        <w:t xml:space="preserve">The dashboard is started with:</w:t>
-      </w:r>
-    </w:p>
-    <w:p>
-      <w:pPr>
-        <w:spacing w:after="120"/>
-      </w:pPr>
-      <w:r>
-        <w:t xml:space="preserve">./startup.sh --dashboard --demo-video --backend omdet_turbo --device auto</w:t>
-      </w:r>
-    </w:p>
-    <w:p>
-      <w:pPr>
-        <w:spacing w:after="120"/>
-      </w:pPr>
-      <w:r>
-        <w:t xml:space="preserve">Counts remain queryable after the process exits:</w:t>
-      </w:r>
-    </w:p>
-    <w:p>
-      <w:pPr>
-        <w:spacing w:after="120"/>
-      </w:pPr>
-      <w:r>
-        <w:t xml:space="preserve">.venv/bin/python query_counts.py runs --limit 1</w:t>
-      </w:r>
-      <w:r>
-        <w:br/>
-        <w:t xml:space="preserve">.venv/bin/python query_counts.py summary</w:t>
-      </w:r>
-    </w:p>
-    <w:p>
-      <w:pPr>
-        <w:pStyle w:val="Heading2"/>
-      </w:pPr>
-      <w:r>
-        <w:t xml:space="preserve">5.2 Model artifact controls</w:t>
-      </w:r>
-    </w:p>
-    <w:p>
-      <w:pPr>
-        <w:spacing w:after="120"/>
-      </w:pPr>
-      <w:r>
-        <w:t xml:space="preserve">Public Hugging Face model revisions are immutable in the application configuration, SafeTensors is preferred, and remote model code is disabled. Custom remote model references must be pinned to a commit and accompanied by a checksum where the download path requires it. Demonstration downloads use HTTPS, redirect validation, size limits, media-signature checks, temporary files, and SHA-256 records.</w:t>
-      </w:r>
-    </w:p>
-    <w:p>
-      <w:pPr>
-        <w:spacing w:after="120"/>
-      </w:pPr>
-      <w:r>
-        <w:t xml:space="preserve">The repository keeps model selection separate from model availability. A public model makes the application immediately deployable for functional use, but only a checkpoint that passes representative accuracy and systems gates should be described as accepted for an operational site.</w:t>
-      </w:r>
-    </w:p>
-    <w:p>
-      <w:pPr>
-        <w:pStyle w:val="Heading2"/>
-      </w:pPr>
-      <w:r>
-        <w:t xml:space="preserve">5.3 Hardware portability</w:t>
-      </w:r>
-    </w:p>
-    <w:p>
-      <w:pPr>
-        <w:spacing w:after="120"/>
-      </w:pPr>
-      <w:r>
-        <w:t xml:space="preserve">The minimum functional baseline is a 64-bit x86_64 or ARM64 computer with four logical CPU cores, 8 GiB of memory, 10 GiB of free storage, Python 3.10–3.14, and network access for initial installation. An accelerator is optional for installation checks, still images, API integration, and low-rate processing.</w:t>
-      </w:r>
-    </w:p>
-    <w:p>
-      <w:pPr>
-        <w:spacing w:after="120"/>
-      </w:pPr>
-      <w:r>
-        <w:t xml:space="preserve">The recommended real-time evaluation baseline is six or more modern logical cores, 16 GiB host memory for a discrete-GPU system, 8 GiB or more accelerator or unified memory, 20 GiB free SSD storage, and a vendor-supported CUDA, ROCm, or JetPack PyTorch environment. These values are capacity-planning baselines, not guaranteed performance.</w:t>
-      </w:r>
-    </w:p>
-    <w:p>
-      <w:pPr>
-        <w:spacing w:after="120"/>
-      </w:pPr>
-      <w:r>
-        <w:t xml:space="preserve">The code exposes CPU, NVIDIA CUDA, AMD ROCm through PyTorch, Apple MPS, and Jetson-oriented paths. Each target must retain its own environment and benchmark record. Results measured on a Tesla T4 cannot be presented as Jetson, AMD, or Apple results.</w:t>
-      </w:r>
-    </w:p>
-    <w:p>
-      <w:pPr>
-        <w:pStyle w:val="Heading2"/>
-      </w:pPr>
-      <w:r>
-        <w:t xml:space="preserve">5.4 Software verification and secure development</w:t>
-      </w:r>
-    </w:p>
-    <w:p>
-      <w:pPr>
-        <w:spacing w:after="120"/>
-      </w:pPr>
-      <w:r>
-        <w:t xml:space="preserve">At the reported revision, 73 automated tests cover configuration, model adapters, tracking, storage, streaming, benchmark output, training-data preparation, evaluation, and API security behavior. The release workflow also checks command-line help paths, shell syntax, package structure, startup regression, static correctness, dependency vulnerabilities, and Python package construction.</w:t>
-      </w:r>
-    </w:p>
-    <w:p>
-      <w:pPr>
-        <w:spacing w:after="120"/>
-      </w:pPr>
-      <w:r>
-        <w:t xml:space="preserve">The security design is organized around concepts from the NIST Secure Software Development Framework and OWASP Application Security Verification Standard [20,21]. Controls include loopback network defaults, bounded media uploads, content-signature validation, browser security headers, parameterized SQL, non-root containers, pinned automation, automated dependency updates, secret scanning, CodeQL analysis, and a private vulnerability-reporting path. This is a secure-development review, not a penetration test, certification, or claim of formal compliance.</w:t>
-      </w:r>
-    </w:p>
-    <w:p>
-      <w:pPr>
-        <w:pStyle w:val="Heading1"/>
-      </w:pPr>
-      <w:r>
-        <w:t xml:space="preserve">6. Evaluation Protocol</w:t>
-      </w:r>
-    </w:p>
-    <w:p>
-      <w:pPr>
-        <w:pStyle w:val="Heading2"/>
-      </w:pPr>
-      <w:r>
-        <w:t xml:space="preserve">6.1 Evaluation principle</w:t>
-      </w:r>
-    </w:p>
-    <w:p>
-      <w:pPr>
-        <w:spacing w:after="120"/>
-      </w:pPr>
-      <w:r>
-        <w:t xml:space="preserve">The evaluated object is one frozen solution configuration: checkpoint, taxonomy, prompts or class head, thresholds, image size, tracker settings, runtime, and Git revision. The purpose is to determine whether the complete system satisfies the use case. The study does not compare detectors for rank.</w:t>
-      </w:r>
-    </w:p>
-    <w:p>
-      <w:pPr>
-        <w:pStyle w:val="Heading2"/>
-      </w:pPr>
-      <w:r>
-        <w:t xml:space="preserve">6.2 Data acquisition and governance</w:t>
-      </w:r>
-    </w:p>
-    <w:p>
-      <w:pPr>
-        <w:spacing w:after="120"/>
-      </w:pPr>
-      <w:r>
-        <w:t xml:space="preserve">Evaluation data should contain the intended truck, sorting-line, fixed-camera, or handheld viewpoint; expected object sizes; empty scenes; confusing background objects; lighting and weather variation; motion blur; occlusion; crushing; contamination; and class imbalance. Sources, licenses, collection dates, sites, sessions, and redistribution restrictions must be recorded.</w:t>
-      </w:r>
-    </w:p>
-    <w:p>
-      <w:pPr>
-        <w:spacing w:after="120"/>
-      </w:pPr>
-      <w:r>
-        <w:t xml:space="preserve">Adjacent frames and repeated views from one video are strongly correlated. Random image-level splitting can place nearly identical content in development and test partitions. Entire source videos, routes, sites, or collection sessions should therefore remain in only one partition. The held-out test set must be frozen and checksummed before checkpoint, threshold, or prompt selection is finalized.</w:t>
-      </w:r>
-    </w:p>
-    <w:p>
-      <w:pPr>
-        <w:spacing w:after="120"/>
-      </w:pPr>
-      <w:r>
-        <w:t xml:space="preserve">Where feasible, a quality-control subset should be labeled independently by at least two annotators. The annotation guide must define partial occlusion, truncation, minimum visible evidence, object grouping, ambiguous material, and non-litter exclusions. Identifiable people, plates, private property, and unnecessary location metadata should be removed or de-identified under the approved protocol.</w:t>
-      </w:r>
-    </w:p>
-    <w:p>
-      <w:pPr>
-        <w:pStyle w:val="Heading2"/>
-      </w:pPr>
-      <w:r>
-        <w:t xml:space="preserve">6.3 Detection and classification measures</w:t>
-      </w:r>
-    </w:p>
-    <w:p>
-      <w:pPr>
-        <w:spacing w:after="120"/>
-      </w:pPr>
-      <w:r>
-        <w:t xml:space="preserve">The final evaluation will report:</w:t>
+        <w:t xml:space="preserve">4.3 Tracking and count semantics</w:t>
+      </w:r>
+    </w:p>
+    <w:p>
+      <w:pPr>
+        <w:spacing w:after="120"/>
+      </w:pPr>
+      <w:r>
+        <w:t xml:space="preserve">The system deliberately reports different quantities:</w:t>
       </w:r>
     </w:p>
     <w:p>
@@ -3108,7 +2592,7 @@
         <w:spacing w:after="60"/>
       </w:pPr>
       <w:r>
-        <w:t xml:space="preserve">precision, recall, and F1 at the frozen operational threshold;</w:t>
+        <w:t xml:space="preserve">visible_counts are detections present in the current frame;</w:t>
       </w:r>
     </w:p>
     <w:p>
@@ -3121,7 +2605,15 @@
         <w:spacing w:after="60"/>
       </w:pPr>
       <w:r>
-        <w:t xml:space="preserve">mAP50 and mAP50–95;</w:t>
+        <w:t xml:space="preserve">confirmed_visible_counts are currently visible detections whose tracks</w:t>
+      </w:r>
+    </w:p>
+    <w:p>
+      <w:pPr>
+        <w:spacing w:after="120"/>
+      </w:pPr>
+      <w:r>
+        <w:t xml:space="preserve">have met a confirmation threshold;</w:t>
       </w:r>
     </w:p>
     <w:p>
@@ -3134,7 +2626,15 @@
         <w:spacing w:after="60"/>
       </w:pPr>
       <w:r>
-        <w:t xml:space="preserve">per-class average precision and support;</w:t>
+        <w:t xml:space="preserve">unique_session_counts are confirmed track identities counted once in one</w:t>
+      </w:r>
+    </w:p>
+    <w:p>
+      <w:pPr>
+        <w:spacing w:after="120"/>
+      </w:pPr>
+      <w:r>
+        <w:t xml:space="preserve">run; and</w:t>
       </w:r>
     </w:p>
     <w:p>
@@ -3147,7 +2647,985 @@
         <w:spacing w:after="60"/>
       </w:pPr>
       <w:r>
-        <w:t xml:space="preserve">a confusion analysis;</w:t>
+        <w:t xml:space="preserve">confirmed_collected_counts are physical pickups separately confirmed by a</w:t>
+      </w:r>
+    </w:p>
+    <w:p>
+      <w:pPr>
+        <w:spacing w:after="120"/>
+      </w:pPr>
+      <w:r>
+        <w:t xml:space="preserve">human, collection controller, sensor-fusion service, or reviewed import.</w:t>
+      </w:r>
+    </w:p>
+    <w:p>
+      <w:pPr>
+        <w:spacing w:after="120"/>
+      </w:pPr>
+      <w:r>
+        <w:t xml:space="preserve">These quantities answer different questions. Visible counts estimate the current scene. Unique-session counts estimate how many track identities were encountered during a run. Confirmed-collected counts represent an external outcome. A detection does not prove collection, and unique counts from different runs cannot be added without accepting possible duplicate physical objects.</w:t>
+      </w:r>
+    </w:p>
+    <w:p>
+      <w:pPr>
+        <w:spacing w:after="120"/>
+      </w:pPr>
+      <w:r>
+        <w:t xml:space="preserve">The default tracker associates boxes by overlap, retains a track across short missed intervals, confirms it after repeated observations, and stabilizes the class using accumulated votes. This reduces frame-by-frame overcounting and label flicker while preserving a dependency-light edge path. For fast-moving vehicle footage or crowded sorting lines, the same detection and event schema can support a stronger tracker or geospatial deduplication after separate validation.</w:t>
+      </w:r>
+    </w:p>
+    <w:p>
+      <w:pPr>
+        <w:spacing w:after="120"/>
+      </w:pPr>
+      <w:r>
+        <w:t xml:space="preserve">The exact default association procedure is:</w:t>
+      </w:r>
+    </w:p>
+    <w:p>
+      <w:pPr>
+        <w:spacing w:after="120"/>
+      </w:pPr>
+      <w:r>
+        <w:t xml:space="preserve">for every active track:</w:t>
+      </w:r>
+      <w:r>
+        <w:br/>
+        <w:t xml:space="preserve">    missed_frames += 1</w:t>
+      </w:r>
+      <w:r>
+        <w:br/>
+        <w:t xml:space="preserve"/>
+      </w:r>
+      <w:r>
+        <w:br/>
+        <w:t xml:space="preserve">for every detection-track pair with IoU &gt;= 0.30:</w:t>
+      </w:r>
+      <w:r>
+        <w:br/>
+        <w:t xml:space="preserve">    score = IoU</w:t>
+      </w:r>
+      <w:r>
+        <w:br/>
+        <w:t xml:space="preserve">    if detection class differs from the track's modal class:</w:t>
+      </w:r>
+      <w:r>
+        <w:br/>
+        <w:t xml:space="preserve">        score *= 0.75</w:t>
+      </w:r>
+      <w:r>
+        <w:br/>
+        <w:t xml:space="preserve"/>
+      </w:r>
+      <w:r>
+        <w:br/>
+        <w:t xml:space="preserve">greedily assign descending scores, at most one detection per track</w:t>
+      </w:r>
+      <w:r>
+        <w:br/>
+        <w:t xml:space="preserve">and one track per detection</w:t>
+      </w:r>
+      <w:r>
+        <w:br/>
+        <w:t xml:space="preserve"/>
+      </w:r>
+      <w:r>
+        <w:br/>
+        <w:t xml:space="preserve">for every matched track:</w:t>
+      </w:r>
+      <w:r>
+        <w:br/>
+        <w:t xml:space="preserve">    update its box, reset missed_frames, increment hits,</w:t>
+      </w:r>
+      <w:r>
+        <w:br/>
+        <w:t xml:space="preserve">    and add one vote for the detected class</w:t>
+      </w:r>
+      <w:r>
+        <w:br/>
+        <w:t xml:space="preserve"/>
+      </w:r>
+      <w:r>
+        <w:br/>
+        <w:t xml:space="preserve">for every unmatched detection:</w:t>
+      </w:r>
+      <w:r>
+        <w:br/>
+        <w:t xml:space="preserve">    create a new track with one hit and one class vote</w:t>
+      </w:r>
+      <w:r>
+        <w:br/>
+        <w:t xml:space="preserve"/>
+      </w:r>
+      <w:r>
+        <w:br/>
+        <w:t xml:space="preserve">emit the modal class accumulated by each track</w:t>
+      </w:r>
+      <w:r>
+        <w:br/>
+        <w:t xml:space="preserve">confirm a track after 2 hits</w:t>
+      </w:r>
+      <w:r>
+        <w:br/>
+        <w:t xml:space="preserve">delete a track after more than 30 missed frames</w:t>
+      </w:r>
+      <w:r>
+        <w:br/>
+        <w:t xml:space="preserve">count each confirmed track ID once per run</w:t>
+      </w:r>
+    </w:p>
+    <w:p>
+      <w:pPr>
+        <w:spacing w:after="120"/>
+      </w:pPr>
+      <w:r>
+        <w:t xml:space="preserve">There is no motion model, appearance embedding, or global assignment solver. This simplicity makes the behavior reproducible and lightweight but also explains the stated limitations under rapid motion, long occlusion, and dense overlap.</w:t>
+      </w:r>
+    </w:p>
+    <w:p>
+      <w:pPr>
+        <w:pStyle w:val="Heading2"/>
+      </w:pPr>
+      <w:r>
+        <w:t xml:space="preserve">4.4 Persistence and offline operation</w:t>
+      </w:r>
+    </w:p>
+    <w:p>
+      <w:pPr>
+        <w:spacing w:after="120"/>
+      </w:pPr>
+      <w:r>
+        <w:t xml:space="preserve">The application writes streaming JSON Lines events, an end-of-run JSON summary, optional annotated media, and a SQLite operational database. SQLite uses write-ahead logging and parameterized statements. The schema includes:</w:t>
+      </w:r>
+    </w:p>
+    <w:tbl>
+      <w:tblPr>
+        <w:tblW w:type="dxa" w:w="9360"/>
+        <w:tblBorders>
+          <w:top w:val="single" w:color="auto" w:sz="4"/>
+          <w:left w:val="single" w:color="auto" w:sz="4"/>
+          <w:bottom w:val="single" w:color="auto" w:sz="4"/>
+          <w:right w:val="single" w:color="auto" w:sz="4"/>
+          <w:insideH w:val="single" w:color="auto" w:sz="4"/>
+          <w:insideV w:val="single" w:color="auto" w:sz="4"/>
+        </w:tblBorders>
+      </w:tblPr>
+      <w:tblGrid>
+        <w:gridCol w:w="4680"/>
+        <w:gridCol w:w="4680"/>
+      </w:tblGrid>
+      <w:tr>
+        <w:tc>
+          <w:tcPr>
+            <w:tcW w:type="dxa" w:w="4680"/>
+            <w:tcBorders>
+              <w:top w:val="single" w:color="CCCCCC" w:sz="1"/>
+              <w:left w:val="single" w:color="CCCCCC" w:sz="1"/>
+              <w:bottom w:val="single" w:color="CCCCCC" w:sz="1"/>
+              <w:right w:val="single" w:color="CCCCCC" w:sz="1"/>
+            </w:tcBorders>
+            <w:shd w:fill="4472C4" w:val="clear"/>
+            <w:tcMar>
+              <w:top w:type="dxa" w:w="40"/>
+              <w:left w:type="dxa" w:w="80"/>
+              <w:bottom w:type="dxa" w:w="40"/>
+              <w:right w:type="dxa" w:w="80"/>
+            </w:tcMar>
+          </w:tcPr>
+          <w:p>
+            <w:r>
+              <w:rPr>
+                <w:rFonts w:ascii="Arial" w:cs="Arial" w:eastAsia="Arial" w:hAnsi="Arial"/>
+                <w:b/>
+                <w:bCs/>
+                <w:color w:val="FFFFFF"/>
+                <w:sz w:val="20"/>
+                <w:szCs w:val="20"/>
+              </w:rPr>
+              <w:t xml:space="preserve">Table</w:t>
+            </w:r>
+          </w:p>
+        </w:tc>
+        <w:tc>
+          <w:tcPr>
+            <w:tcW w:type="dxa" w:w="4680"/>
+            <w:tcBorders>
+              <w:top w:val="single" w:color="CCCCCC" w:sz="1"/>
+              <w:left w:val="single" w:color="CCCCCC" w:sz="1"/>
+              <w:bottom w:val="single" w:color="CCCCCC" w:sz="1"/>
+              <w:right w:val="single" w:color="CCCCCC" w:sz="1"/>
+            </w:tcBorders>
+            <w:shd w:fill="4472C4" w:val="clear"/>
+            <w:tcMar>
+              <w:top w:type="dxa" w:w="40"/>
+              <w:left w:type="dxa" w:w="80"/>
+              <w:bottom w:type="dxa" w:w="40"/>
+              <w:right w:type="dxa" w:w="80"/>
+            </w:tcMar>
+          </w:tcPr>
+          <w:p>
+            <w:r>
+              <w:rPr>
+                <w:rFonts w:ascii="Arial" w:cs="Arial" w:eastAsia="Arial" w:hAnsi="Arial"/>
+                <w:b/>
+                <w:bCs/>
+                <w:color w:val="FFFFFF"/>
+                <w:sz w:val="20"/>
+                <w:szCs w:val="20"/>
+              </w:rPr>
+              <w:t xml:space="preserve">Purpose</w:t>
+            </w:r>
+          </w:p>
+        </w:tc>
+      </w:tr>
+      <w:tr>
+        <w:tc>
+          <w:tcPr>
+            <w:tcW w:type="dxa" w:w="4680"/>
+            <w:tcBorders>
+              <w:top w:val="single" w:color="CCCCCC" w:sz="1"/>
+              <w:left w:val="single" w:color="CCCCCC" w:sz="1"/>
+              <w:bottom w:val="single" w:color="CCCCCC" w:sz="1"/>
+              <w:right w:val="single" w:color="CCCCCC" w:sz="1"/>
+            </w:tcBorders>
+            <w:tcMar>
+              <w:top w:type="dxa" w:w="40"/>
+              <w:left w:type="dxa" w:w="80"/>
+              <w:bottom w:type="dxa" w:w="40"/>
+              <w:right w:type="dxa" w:w="80"/>
+            </w:tcMar>
+          </w:tcPr>
+          <w:p>
+            <w:r>
+              <w:rPr>
+                <w:rFonts w:ascii="Arial" w:cs="Arial" w:eastAsia="Arial" w:hAnsi="Arial"/>
+                <w:sz w:val="20"/>
+                <w:szCs w:val="20"/>
+              </w:rPr>
+              <w:t xml:space="preserve">runs</w:t>
+            </w:r>
+          </w:p>
+        </w:tc>
+        <w:tc>
+          <w:tcPr>
+            <w:tcW w:type="dxa" w:w="4680"/>
+            <w:tcBorders>
+              <w:top w:val="single" w:color="CCCCCC" w:sz="1"/>
+              <w:left w:val="single" w:color="CCCCCC" w:sz="1"/>
+              <w:bottom w:val="single" w:color="CCCCCC" w:sz="1"/>
+              <w:right w:val="single" w:color="CCCCCC" w:sz="1"/>
+            </w:tcBorders>
+            <w:tcMar>
+              <w:top w:type="dxa" w:w="40"/>
+              <w:left w:type="dxa" w:w="80"/>
+              <w:bottom w:type="dxa" w:w="40"/>
+              <w:right w:type="dxa" w:w="80"/>
+            </w:tcMar>
+          </w:tcPr>
+          <w:p>
+            <w:r>
+              <w:rPr>
+                <w:rFonts w:ascii="Arial" w:cs="Arial" w:eastAsia="Arial" w:hAnsi="Arial"/>
+                <w:sz w:val="20"/>
+                <w:szCs w:val="20"/>
+              </w:rPr>
+              <w:t xml:space="preserve">source, device, vehicle, route, status, timing, and final counts</w:t>
+            </w:r>
+          </w:p>
+        </w:tc>
+      </w:tr>
+      <w:tr>
+        <w:tc>
+          <w:tcPr>
+            <w:tcW w:type="dxa" w:w="4680"/>
+            <w:tcBorders>
+              <w:top w:val="single" w:color="CCCCCC" w:sz="1"/>
+              <w:left w:val="single" w:color="CCCCCC" w:sz="1"/>
+              <w:bottom w:val="single" w:color="CCCCCC" w:sz="1"/>
+              <w:right w:val="single" w:color="CCCCCC" w:sz="1"/>
+            </w:tcBorders>
+            <w:tcMar>
+              <w:top w:type="dxa" w:w="40"/>
+              <w:left w:type="dxa" w:w="80"/>
+              <w:bottom w:type="dxa" w:w="40"/>
+              <w:right w:type="dxa" w:w="80"/>
+            </w:tcMar>
+          </w:tcPr>
+          <w:p>
+            <w:r>
+              <w:rPr>
+                <w:rFonts w:ascii="Arial" w:cs="Arial" w:eastAsia="Arial" w:hAnsi="Arial"/>
+                <w:sz w:val="20"/>
+                <w:szCs w:val="20"/>
+              </w:rPr>
+              <w:t xml:space="preserve">frame_observations</w:t>
+            </w:r>
+          </w:p>
+        </w:tc>
+        <w:tc>
+          <w:tcPr>
+            <w:tcW w:type="dxa" w:w="4680"/>
+            <w:tcBorders>
+              <w:top w:val="single" w:color="CCCCCC" w:sz="1"/>
+              <w:left w:val="single" w:color="CCCCCC" w:sz="1"/>
+              <w:bottom w:val="single" w:color="CCCCCC" w:sz="1"/>
+              <w:right w:val="single" w:color="CCCCCC" w:sz="1"/>
+            </w:tcBorders>
+            <w:tcMar>
+              <w:top w:type="dxa" w:w="40"/>
+              <w:left w:type="dxa" w:w="80"/>
+              <w:bottom w:type="dxa" w:w="40"/>
+              <w:right w:type="dxa" w:w="80"/>
+            </w:tcMar>
+          </w:tcPr>
+          <w:p>
+            <w:r>
+              <w:rPr>
+                <w:rFonts w:ascii="Arial" w:cs="Arial" w:eastAsia="Arial" w:hAnsi="Arial"/>
+                <w:sz w:val="20"/>
+                <w:szCs w:val="20"/>
+              </w:rPr>
+              <w:t xml:space="preserve">per-frame visible and cumulative unique counts</w:t>
+            </w:r>
+          </w:p>
+        </w:tc>
+      </w:tr>
+      <w:tr>
+        <w:tc>
+          <w:tcPr>
+            <w:tcW w:type="dxa" w:w="4680"/>
+            <w:tcBorders>
+              <w:top w:val="single" w:color="CCCCCC" w:sz="1"/>
+              <w:left w:val="single" w:color="CCCCCC" w:sz="1"/>
+              <w:bottom w:val="single" w:color="CCCCCC" w:sz="1"/>
+              <w:right w:val="single" w:color="CCCCCC" w:sz="1"/>
+            </w:tcBorders>
+            <w:tcMar>
+              <w:top w:type="dxa" w:w="40"/>
+              <w:left w:type="dxa" w:w="80"/>
+              <w:bottom w:type="dxa" w:w="40"/>
+              <w:right w:type="dxa" w:w="80"/>
+            </w:tcMar>
+          </w:tcPr>
+          <w:p>
+            <w:r>
+              <w:rPr>
+                <w:rFonts w:ascii="Arial" w:cs="Arial" w:eastAsia="Arial" w:hAnsi="Arial"/>
+                <w:sz w:val="20"/>
+                <w:szCs w:val="20"/>
+              </w:rPr>
+              <w:t xml:space="preserve">detections</w:t>
+            </w:r>
+          </w:p>
+        </w:tc>
+        <w:tc>
+          <w:tcPr>
+            <w:tcW w:type="dxa" w:w="4680"/>
+            <w:tcBorders>
+              <w:top w:val="single" w:color="CCCCCC" w:sz="1"/>
+              <w:left w:val="single" w:color="CCCCCC" w:sz="1"/>
+              <w:bottom w:val="single" w:color="CCCCCC" w:sz="1"/>
+              <w:right w:val="single" w:color="CCCCCC" w:sz="1"/>
+            </w:tcBorders>
+            <w:tcMar>
+              <w:top w:type="dxa" w:w="40"/>
+              <w:left w:type="dxa" w:w="80"/>
+              <w:bottom w:type="dxa" w:w="40"/>
+              <w:right w:type="dxa" w:w="80"/>
+            </w:tcMar>
+          </w:tcPr>
+          <w:p>
+            <w:r>
+              <w:rPr>
+                <w:rFonts w:ascii="Arial" w:cs="Arial" w:eastAsia="Arial" w:hAnsi="Arial"/>
+                <w:sz w:val="20"/>
+                <w:szCs w:val="20"/>
+              </w:rPr>
+              <w:t xml:space="preserve">optional detailed boxes and tracks</w:t>
+            </w:r>
+          </w:p>
+        </w:tc>
+      </w:tr>
+      <w:tr>
+        <w:tc>
+          <w:tcPr>
+            <w:tcW w:type="dxa" w:w="4680"/>
+            <w:tcBorders>
+              <w:top w:val="single" w:color="CCCCCC" w:sz="1"/>
+              <w:left w:val="single" w:color="CCCCCC" w:sz="1"/>
+              <w:bottom w:val="single" w:color="CCCCCC" w:sz="1"/>
+              <w:right w:val="single" w:color="CCCCCC" w:sz="1"/>
+            </w:tcBorders>
+            <w:tcMar>
+              <w:top w:type="dxa" w:w="40"/>
+              <w:left w:type="dxa" w:w="80"/>
+              <w:bottom w:type="dxa" w:w="40"/>
+              <w:right w:type="dxa" w:w="80"/>
+            </w:tcMar>
+          </w:tcPr>
+          <w:p>
+            <w:r>
+              <w:rPr>
+                <w:rFonts w:ascii="Arial" w:cs="Arial" w:eastAsia="Arial" w:hAnsi="Arial"/>
+                <w:sz w:val="20"/>
+                <w:szCs w:val="20"/>
+              </w:rPr>
+              <w:t xml:space="preserve">run_class_counts</w:t>
+            </w:r>
+          </w:p>
+        </w:tc>
+        <w:tc>
+          <w:tcPr>
+            <w:tcW w:type="dxa" w:w="4680"/>
+            <w:tcBorders>
+              <w:top w:val="single" w:color="CCCCCC" w:sz="1"/>
+              <w:left w:val="single" w:color="CCCCCC" w:sz="1"/>
+              <w:bottom w:val="single" w:color="CCCCCC" w:sz="1"/>
+              <w:right w:val="single" w:color="CCCCCC" w:sz="1"/>
+            </w:tcBorders>
+            <w:tcMar>
+              <w:top w:type="dxa" w:w="40"/>
+              <w:left w:type="dxa" w:w="80"/>
+              <w:bottom w:type="dxa" w:w="40"/>
+              <w:right w:type="dxa" w:w="80"/>
+            </w:tcMar>
+          </w:tcPr>
+          <w:p>
+            <w:r>
+              <w:rPr>
+                <w:rFonts w:ascii="Arial" w:cs="Arial" w:eastAsia="Arial" w:hAnsi="Arial"/>
+                <w:sz w:val="20"/>
+                <w:szCs w:val="20"/>
+              </w:rPr>
+              <w:t xml:space="preserve">query-friendly final class totals</w:t>
+            </w:r>
+          </w:p>
+        </w:tc>
+      </w:tr>
+      <w:tr>
+        <w:tc>
+          <w:tcPr>
+            <w:tcW w:type="dxa" w:w="4680"/>
+            <w:tcBorders>
+              <w:top w:val="single" w:color="CCCCCC" w:sz="1"/>
+              <w:left w:val="single" w:color="CCCCCC" w:sz="1"/>
+              <w:bottom w:val="single" w:color="CCCCCC" w:sz="1"/>
+              <w:right w:val="single" w:color="CCCCCC" w:sz="1"/>
+            </w:tcBorders>
+            <w:tcMar>
+              <w:top w:type="dxa" w:w="40"/>
+              <w:left w:type="dxa" w:w="80"/>
+              <w:bottom w:type="dxa" w:w="40"/>
+              <w:right w:type="dxa" w:w="80"/>
+            </w:tcMar>
+          </w:tcPr>
+          <w:p>
+            <w:r>
+              <w:rPr>
+                <w:rFonts w:ascii="Arial" w:cs="Arial" w:eastAsia="Arial" w:hAnsi="Arial"/>
+                <w:sz w:val="20"/>
+                <w:szCs w:val="20"/>
+              </w:rPr>
+              <w:t xml:space="preserve">review_queue</w:t>
+            </w:r>
+          </w:p>
+        </w:tc>
+        <w:tc>
+          <w:tcPr>
+            <w:tcW w:type="dxa" w:w="4680"/>
+            <w:tcBorders>
+              <w:top w:val="single" w:color="CCCCCC" w:sz="1"/>
+              <w:left w:val="single" w:color="CCCCCC" w:sz="1"/>
+              <w:bottom w:val="single" w:color="CCCCCC" w:sz="1"/>
+              <w:right w:val="single" w:color="CCCCCC" w:sz="1"/>
+            </w:tcBorders>
+            <w:tcMar>
+              <w:top w:type="dxa" w:w="40"/>
+              <w:left w:type="dxa" w:w="80"/>
+              <w:bottom w:type="dxa" w:w="40"/>
+              <w:right w:type="dxa" w:w="80"/>
+            </w:tcMar>
+          </w:tcPr>
+          <w:p>
+            <w:r>
+              <w:rPr>
+                <w:rFonts w:ascii="Arial" w:cs="Arial" w:eastAsia="Arial" w:hAnsi="Arial"/>
+                <w:sz w:val="20"/>
+                <w:szCs w:val="20"/>
+              </w:rPr>
+              <w:t xml:space="preserve">pending, confirmed, corrected, or rejected classifications</w:t>
+            </w:r>
+          </w:p>
+        </w:tc>
+      </w:tr>
+      <w:tr>
+        <w:tc>
+          <w:tcPr>
+            <w:tcW w:type="dxa" w:w="4680"/>
+            <w:tcBorders>
+              <w:top w:val="single" w:color="CCCCCC" w:sz="1"/>
+              <w:left w:val="single" w:color="CCCCCC" w:sz="1"/>
+              <w:bottom w:val="single" w:color="CCCCCC" w:sz="1"/>
+              <w:right w:val="single" w:color="CCCCCC" w:sz="1"/>
+            </w:tcBorders>
+            <w:tcMar>
+              <w:top w:type="dxa" w:w="40"/>
+              <w:left w:type="dxa" w:w="80"/>
+              <w:bottom w:type="dxa" w:w="40"/>
+              <w:right w:type="dxa" w:w="80"/>
+            </w:tcMar>
+          </w:tcPr>
+          <w:p>
+            <w:r>
+              <w:rPr>
+                <w:rFonts w:ascii="Arial" w:cs="Arial" w:eastAsia="Arial" w:hAnsi="Arial"/>
+                <w:sz w:val="20"/>
+                <w:szCs w:val="20"/>
+              </w:rPr>
+              <w:t xml:space="preserve">collection_confirmations</w:t>
+            </w:r>
+          </w:p>
+        </w:tc>
+        <w:tc>
+          <w:tcPr>
+            <w:tcW w:type="dxa" w:w="4680"/>
+            <w:tcBorders>
+              <w:top w:val="single" w:color="CCCCCC" w:sz="1"/>
+              <w:left w:val="single" w:color="CCCCCC" w:sz="1"/>
+              <w:bottom w:val="single" w:color="CCCCCC" w:sz="1"/>
+              <w:right w:val="single" w:color="CCCCCC" w:sz="1"/>
+            </w:tcBorders>
+            <w:tcMar>
+              <w:top w:type="dxa" w:w="40"/>
+              <w:left w:type="dxa" w:w="80"/>
+              <w:bottom w:type="dxa" w:w="40"/>
+              <w:right w:type="dxa" w:w="80"/>
+            </w:tcMar>
+          </w:tcPr>
+          <w:p>
+            <w:r>
+              <w:rPr>
+                <w:rFonts w:ascii="Arial" w:cs="Arial" w:eastAsia="Arial" w:hAnsi="Arial"/>
+                <w:sz w:val="20"/>
+                <w:szCs w:val="20"/>
+              </w:rPr>
+              <w:t xml:space="preserve">independently confirmed physical pickups</w:t>
+            </w:r>
+          </w:p>
+        </w:tc>
+      </w:tr>
+      <w:tr>
+        <w:tc>
+          <w:tcPr>
+            <w:tcW w:type="dxa" w:w="4680"/>
+            <w:tcBorders>
+              <w:top w:val="single" w:color="CCCCCC" w:sz="1"/>
+              <w:left w:val="single" w:color="CCCCCC" w:sz="1"/>
+              <w:bottom w:val="single" w:color="CCCCCC" w:sz="1"/>
+              <w:right w:val="single" w:color="CCCCCC" w:sz="1"/>
+            </w:tcBorders>
+            <w:tcMar>
+              <w:top w:type="dxa" w:w="40"/>
+              <w:left w:type="dxa" w:w="80"/>
+              <w:bottom w:type="dxa" w:w="40"/>
+              <w:right w:type="dxa" w:w="80"/>
+            </w:tcMar>
+          </w:tcPr>
+          <w:p>
+            <w:r>
+              <w:rPr>
+                <w:rFonts w:ascii="Arial" w:cs="Arial" w:eastAsia="Arial" w:hAnsi="Arial"/>
+                <w:sz w:val="20"/>
+                <w:szCs w:val="20"/>
+              </w:rPr>
+              <w:t xml:space="preserve">integration_outbox</w:t>
+            </w:r>
+          </w:p>
+        </w:tc>
+        <w:tc>
+          <w:tcPr>
+            <w:tcW w:type="dxa" w:w="4680"/>
+            <w:tcBorders>
+              <w:top w:val="single" w:color="CCCCCC" w:sz="1"/>
+              <w:left w:val="single" w:color="CCCCCC" w:sz="1"/>
+              <w:bottom w:val="single" w:color="CCCCCC" w:sz="1"/>
+              <w:right w:val="single" w:color="CCCCCC" w:sz="1"/>
+            </w:tcBorders>
+            <w:tcMar>
+              <w:top w:type="dxa" w:w="40"/>
+              <w:left w:type="dxa" w:w="80"/>
+              <w:bottom w:type="dxa" w:w="40"/>
+              <w:right w:type="dxa" w:w="80"/>
+            </w:tcMar>
+          </w:tcPr>
+          <w:p>
+            <w:r>
+              <w:rPr>
+                <w:rFonts w:ascii="Arial" w:cs="Arial" w:eastAsia="Arial" w:hAnsi="Arial"/>
+                <w:sz w:val="20"/>
+                <w:szCs w:val="20"/>
+              </w:rPr>
+              <w:t xml:space="preserve">durable events waiting for an external acknowledgement</w:t>
+            </w:r>
+          </w:p>
+        </w:tc>
+      </w:tr>
+    </w:tbl>
+    <w:p>
+      <w:pPr>
+        <w:spacing w:after="120"/>
+      </w:pPr>
+    </w:p>
+    <w:p>
+      <w:pPr>
+        <w:spacing w:after="120"/>
+      </w:pPr>
+      <w:r>
+        <w:t xml:space="preserve">Detailed detection rows are disabled by default to reduce long-term storage. Operators can retain counts and summaries while applying a shorter retention period to raw or annotated media. The outbox pattern permits a vehicle to continue operating without network connectivity and forward events later through an organization-controlled authenticated transport.</w:t>
+      </w:r>
+    </w:p>
+    <w:p>
+      <w:pPr>
+        <w:pStyle w:val="Heading2"/>
+      </w:pPr>
+      <w:r>
+        <w:t xml:space="preserve">4.5 Human-assisted separation</w:t>
+      </w:r>
+    </w:p>
+    <w:p>
+      <w:pPr>
+        <w:spacing w:after="120"/>
+      </w:pPr>
+      <w:r>
+        <w:t xml:space="preserve">Predicted classes can be mapped to site-specific material streams. A dashboard or external application can display the class, confidence, destination, and review state to a worker. Corrections are auditable and do not silently rewrite the original model observation.</w:t>
+      </w:r>
+    </w:p>
+    <w:p>
+      <w:pPr>
+        <w:spacing w:after="120"/>
+      </w:pPr>
+      <w:r>
+        <w:t xml:space="preserve">The separation mapping is advisory. Composite, contaminated, hazardous, or unknown material may require a manual decision. Batteries, electronic waste, broken glass, sharps, chemicals, and pressurized containers require local safety procedures beyond a visual prediction.</w:t>
+      </w:r>
+    </w:p>
+    <w:p>
+      <w:pPr>
+        <w:pStyle w:val="Heading2"/>
+      </w:pPr>
+      <w:r>
+        <w:t xml:space="preserve">4.6 Dashboard and API</w:t>
+      </w:r>
+    </w:p>
+    <w:p>
+      <w:pPr>
+        <w:spacing w:after="120"/>
+      </w:pPr>
+      <w:r>
+        <w:t xml:space="preserve">The FastAPI service provides health and readiness endpoints, image detection, stream-session control, count queries, review operations, collection confirmation, and outbox acknowledgement. It also serves a dependency-free browser dashboard. A server-side session can open a camera or file on the edge computer, avoiding the false assumption that a browser camera index refers to the remote device.</w:t>
+      </w:r>
+    </w:p>
+    <w:p>
+      <w:pPr>
+        <w:spacing w:after="120"/>
+      </w:pPr>
+      <w:r>
+        <w:t xml:space="preserve">The API binds to loopback by default and has no built-in multi-user identity system. Remote access should use an SSH tunnel or a mature authenticated gateway. The project does not recommend exposing the service directly to the public Internet.</w:t>
+      </w:r>
+    </w:p>
+    <w:p>
+      <w:pPr>
+        <w:pStyle w:val="Heading2"/>
+      </w:pPr>
+      <w:r>
+        <w:t xml:space="preserve">4.7 Machinery-safety boundary</w:t>
+      </w:r>
+    </w:p>
+    <w:p>
+      <w:pPr>
+        <w:spacing w:after="120"/>
+      </w:pPr>
+      <w:r>
+        <w:t xml:space="preserve">Perception output may inform an operator or task planner, but it must not directly move hydraulic, pneumatic, or electric equipment. A production collection arm requires an independent safety-rated controller, emergency stops, manual override, exclusion-zone and proximity sensing, arm-position and load limits, stale-signal handling, and positive pickup confirmation. If safety inputs are missing or contradictory, motion must remain inhibited.</w:t>
+      </w:r>
+    </w:p>
+    <w:p>
+      <w:pPr>
+        <w:spacing w:after="120"/>
+      </w:pPr>
+      <w:r>
+        <w:t xml:space="preserve">This boundary prevents a probabilistic class or box from becoming an unreviewed actuation command. It also preserves the difference between “an object was observed” and “an object was collected.”</w:t>
+      </w:r>
+    </w:p>
+    <w:p>
+      <w:pPr>
+        <w:pStyle w:val="Heading1"/>
+      </w:pPr>
+      <w:r>
+        <w:t xml:space="preserve">5. Implementation and Reproducibility</w:t>
+      </w:r>
+    </w:p>
+    <w:p>
+      <w:pPr>
+        <w:pStyle w:val="Heading2"/>
+      </w:pPr>
+      <w:r>
+        <w:t xml:space="preserve">5.1 Software release</w:t>
+      </w:r>
+    </w:p>
+    <w:p>
+      <w:pPr>
+        <w:spacing w:after="120"/>
+      </w:pPr>
+      <w:r>
+        <w:t xml:space="preserve">The implementation described in this preprint is Edge Litter Detection version 0.10.1 at Git commit 756fa2ae0b8686bb4b97940911710dc73f8efd90 [7]. Code and project documentation are released under Apache License 2.0. Model checkpoints and datasets retain their own licenses and are not relicensed by the repository.</w:t>
+      </w:r>
+    </w:p>
+    <w:p>
+      <w:pPr>
+        <w:spacing w:after="120"/>
+      </w:pPr>
+      <w:r>
+        <w:t xml:space="preserve">The primary entry point is:</w:t>
+      </w:r>
+    </w:p>
+    <w:p>
+      <w:pPr>
+        <w:spacing w:after="120"/>
+      </w:pPr>
+      <w:r>
+        <w:t xml:space="preserve">git clone https://github.com/biolababs/edge-litter-detection.git</w:t>
+      </w:r>
+      <w:r>
+        <w:br/>
+        <w:t xml:space="preserve">cd edge-litter-detection</w:t>
+      </w:r>
+      <w:r>
+        <w:br/>
+        <w:t xml:space="preserve">./startup.sh --backend omdet_turbo --demo-video --no-display</w:t>
+      </w:r>
+    </w:p>
+    <w:p>
+      <w:pPr>
+        <w:spacing w:after="120"/>
+      </w:pPr>
+      <w:r>
+        <w:t xml:space="preserve">In this paper, a clean-clone workflow means execution from a fresh source checkout on a supported host with no pre-existing project virtual environment, model cache, private checkpoint, or API credential. Internet access is allowed for public dependency, model, and attributed demonstration downloads.</w:t>
+      </w:r>
+    </w:p>
+    <w:p>
+      <w:pPr>
+        <w:spacing w:after="120"/>
+      </w:pPr>
+      <w:r>
+        <w:t xml:space="preserve">The launcher creates or reuses a virtual environment, installs the selected runtime, downloads attributed demonstration media when requested, downloads a pinned public checkpoint, runs inference, and writes evidence. Attached cameras and network streams use the same path:</w:t>
+      </w:r>
+    </w:p>
+    <w:p>
+      <w:pPr>
+        <w:spacing w:after="120"/>
+      </w:pPr>
+      <w:r>
+        <w:t xml:space="preserve">./startup.sh --source 0 --backend omdet_turbo</w:t>
+      </w:r>
+      <w:r>
+        <w:br/>
+        <w:t xml:space="preserve"/>
+      </w:r>
+      <w:r>
+        <w:br/>
+        <w:t xml:space="preserve">export LITTER_STREAM_URL="rtsp://camera-host/live"</w:t>
+      </w:r>
+      <w:r>
+        <w:br/>
+        <w:t xml:space="preserve">./startup.sh --source "$LITTER_STREAM_URL" --backend omdet_turbo --no-display</w:t>
+      </w:r>
+    </w:p>
+    <w:p>
+      <w:pPr>
+        <w:spacing w:after="120"/>
+      </w:pPr>
+      <w:r>
+        <w:t xml:space="preserve">The dashboard is started with:</w:t>
+      </w:r>
+    </w:p>
+    <w:p>
+      <w:pPr>
+        <w:spacing w:after="120"/>
+      </w:pPr>
+      <w:r>
+        <w:t xml:space="preserve">./startup.sh --dashboard --demo-video --backend omdet_turbo --device auto</w:t>
+      </w:r>
+    </w:p>
+    <w:p>
+      <w:pPr>
+        <w:spacing w:after="120"/>
+      </w:pPr>
+      <w:r>
+        <w:t xml:space="preserve">Counts remain queryable after the process exits:</w:t>
+      </w:r>
+    </w:p>
+    <w:p>
+      <w:pPr>
+        <w:spacing w:after="120"/>
+      </w:pPr>
+      <w:r>
+        <w:t xml:space="preserve">.venv/bin/python query_counts.py runs --limit 1</w:t>
+      </w:r>
+      <w:r>
+        <w:br/>
+        <w:t xml:space="preserve">.venv/bin/python query_counts.py summary</w:t>
+      </w:r>
+    </w:p>
+    <w:p>
+      <w:pPr>
+        <w:pStyle w:val="Heading2"/>
+      </w:pPr>
+      <w:r>
+        <w:t xml:space="preserve">5.2 Model artifact controls</w:t>
+      </w:r>
+    </w:p>
+    <w:p>
+      <w:pPr>
+        <w:spacing w:after="120"/>
+      </w:pPr>
+      <w:r>
+        <w:t xml:space="preserve">Public Hugging Face model revisions are immutable in the application configuration, SafeTensors is preferred, and remote model code is disabled. Custom remote model references must be pinned to a commit and accompanied by a checksum where the download path requires it. Demonstration downloads use HTTPS, redirect validation, size limits, media-signature checks, temporary files, and SHA-256 records.</w:t>
+      </w:r>
+    </w:p>
+    <w:p>
+      <w:pPr>
+        <w:spacing w:after="120"/>
+      </w:pPr>
+      <w:r>
+        <w:t xml:space="preserve">The repository keeps model selection separate from model availability. A public model makes the application immediately deployable for functional use, but only a checkpoint that passes representative accuracy and systems gates should be described as accepted for an operational site.</w:t>
+      </w:r>
+    </w:p>
+    <w:p>
+      <w:pPr>
+        <w:pStyle w:val="Heading2"/>
+      </w:pPr>
+      <w:r>
+        <w:t xml:space="preserve">5.3 Hardware portability</w:t>
+      </w:r>
+    </w:p>
+    <w:p>
+      <w:pPr>
+        <w:spacing w:after="120"/>
+      </w:pPr>
+      <w:r>
+        <w:t xml:space="preserve">The minimum functional baseline is a 64-bit x86_64 or ARM64 computer with four logical CPU cores, 8 GiB of memory, 10 GiB of free storage, Python 3.10–3.14, and network access for initial installation. An accelerator is optional for installation checks, still images, API integration, and low-rate processing.</w:t>
+      </w:r>
+    </w:p>
+    <w:p>
+      <w:pPr>
+        <w:spacing w:after="120"/>
+      </w:pPr>
+      <w:r>
+        <w:t xml:space="preserve">The recommended real-time evaluation baseline is six or more modern logical cores, 16 GiB host memory for a discrete-GPU system, 8 GiB or more accelerator or unified memory, 20 GiB free SSD storage, and a vendor-supported CUDA, ROCm, or JetPack PyTorch environment. These values are capacity-planning baselines, not guaranteed performance.</w:t>
+      </w:r>
+    </w:p>
+    <w:p>
+      <w:pPr>
+        <w:spacing w:after="120"/>
+      </w:pPr>
+      <w:r>
+        <w:t xml:space="preserve">The code exposes CPU, NVIDIA CUDA, AMD ROCm through PyTorch, Apple MPS, and Jetson-oriented paths. Each target must retain its own environment and benchmark record. Results measured on a Tesla T4 cannot be presented as Jetson, AMD, or Apple results.</w:t>
+      </w:r>
+    </w:p>
+    <w:p>
+      <w:pPr>
+        <w:pStyle w:val="Heading2"/>
+      </w:pPr>
+      <w:r>
+        <w:t xml:space="preserve">5.4 Software verification and secure development</w:t>
+      </w:r>
+    </w:p>
+    <w:p>
+      <w:pPr>
+        <w:spacing w:after="120"/>
+      </w:pPr>
+      <w:r>
+        <w:t xml:space="preserve">At the reported revision, 76 automated tests cover configuration, model adapters, tracking, storage, streaming, benchmark output, training-data preparation, evaluation, and API security behavior. The release workflow also checks command-line help paths, shell syntax, package structure, startup regression, static correctness, dependency vulnerabilities, and Python package construction.</w:t>
+      </w:r>
+    </w:p>
+    <w:p>
+      <w:pPr>
+        <w:spacing w:after="120"/>
+      </w:pPr>
+      <w:r>
+        <w:t xml:space="preserve">The security design is organized around concepts from the NIST Secure Software Development Framework and OWASP Application Security Verification Standard [20,21]. Controls include loopback network defaults, bounded media uploads, content-signature validation, browser security headers, parameterized SQL, non-root containers, pinned automation, automated dependency updates, secret scanning, CodeQL analysis, and a private vulnerability-reporting path. This is a secure-development review, not a penetration test, certification, or claim of formal compliance.</w:t>
+      </w:r>
+    </w:p>
+    <w:p>
+      <w:pPr>
+        <w:pStyle w:val="Heading1"/>
+      </w:pPr>
+      <w:r>
+        <w:t xml:space="preserve">6. Evaluation Protocol</w:t>
+      </w:r>
+    </w:p>
+    <w:p>
+      <w:pPr>
+        <w:pStyle w:val="Heading2"/>
+      </w:pPr>
+      <w:r>
+        <w:t xml:space="preserve">6.1 Evaluation principle</w:t>
+      </w:r>
+    </w:p>
+    <w:p>
+      <w:pPr>
+        <w:spacing w:after="120"/>
+      </w:pPr>
+      <w:r>
+        <w:t xml:space="preserve">The evaluated object is one frozen solution configuration: checkpoint, taxonomy, prompts or class head, thresholds, image size, tracker settings, runtime, and Git revision. The purpose is to determine whether the complete system satisfies the use case. The study does not compare detectors for rank.</w:t>
+      </w:r>
+    </w:p>
+    <w:p>
+      <w:pPr>
+        <w:pStyle w:val="Heading2"/>
+      </w:pPr>
+      <w:r>
+        <w:t xml:space="preserve">6.2 Data acquisition and governance</w:t>
+      </w:r>
+    </w:p>
+    <w:p>
+      <w:pPr>
+        <w:spacing w:after="120"/>
+      </w:pPr>
+      <w:r>
+        <w:t xml:space="preserve">Evaluation data should contain the intended truck, sorting-line, fixed-camera, or handheld viewpoint; expected object sizes; empty scenes; confusing background objects; lighting and weather variation; motion blur; occlusion; crushing; contamination; and class imbalance. Sources, licenses, collection dates, sites, sessions, and redistribution restrictions must be recorded.</w:t>
+      </w:r>
+    </w:p>
+    <w:p>
+      <w:pPr>
+        <w:spacing w:after="120"/>
+      </w:pPr>
+      <w:r>
+        <w:t xml:space="preserve">Adjacent frames and repeated views from one video are strongly correlated. Random image-level splitting can place nearly identical content in development and test partitions. Entire source videos, routes, sites, or collection sessions should therefore remain in only one partition. The held-out test set must be frozen and checksummed before checkpoint, threshold, or prompt selection is finalized.</w:t>
+      </w:r>
+    </w:p>
+    <w:p>
+      <w:pPr>
+        <w:spacing w:after="120"/>
+      </w:pPr>
+      <w:r>
+        <w:t xml:space="preserve">Where feasible, a quality-control subset should be labeled independently by at least two annotators. The annotation guide must define partial occlusion, truncation, minimum visible evidence, object grouping, ambiguous material, and non-litter exclusions. Identifiable people, plates, private property, and unnecessary location metadata should be removed or de-identified under the approved protocol.</w:t>
+      </w:r>
+    </w:p>
+    <w:p>
+      <w:pPr>
+        <w:pStyle w:val="Heading2"/>
+      </w:pPr>
+      <w:r>
+        <w:t xml:space="preserve">6.3 Detection and classification measures</w:t>
+      </w:r>
+    </w:p>
+    <w:p>
+      <w:pPr>
+        <w:spacing w:after="120"/>
+      </w:pPr>
+      <w:r>
+        <w:t xml:space="preserve">The final evaluation will report:</w:t>
       </w:r>
     </w:p>
     <w:p>
@@ -3160,15 +3638,7 @@
         <w:spacing w:after="60"/>
       </w:pPr>
       <w:r>
-        <w:t xml:space="preserve">results by object size, lighting, weather, clutter, occlusion, distance, and</w:t>
-      </w:r>
-    </w:p>
-    <w:p>
-      <w:pPr>
-        <w:spacing w:after="120"/>
-      </w:pPr>
-      <w:r>
-        <w:t xml:space="preserve">scene type; and</w:t>
+        <w:t xml:space="preserve">precision, recall, and F1 at the frozen operational threshold;</w:t>
       </w:r>
     </w:p>
     <w:p>
@@ -3181,55 +3651,7 @@
         <w:spacing w:after="60"/>
       </w:pPr>
       <w:r>
-        <w:t xml:space="preserve">human-review rate and correction rate.</w:t>
-      </w:r>
-    </w:p>
-    <w:p>
-      <w:pPr>
-        <w:spacing w:after="120"/>
-      </w:pPr>
-      <w:r>
-        <w:t xml:space="preserve">No class should be advertised as supported if it lacks held-out examples. Aggregate mAP must not conceal poor recall for a hazardous or operationally important minority class.</w:t>
-      </w:r>
-    </w:p>
-    <w:p>
-      <w:pPr>
-        <w:pStyle w:val="Heading2"/>
-      </w:pPr>
-      <w:r>
-        <w:t xml:space="preserve">6.4 Counting measures</w:t>
-      </w:r>
-    </w:p>
-    <w:p>
-      <w:pPr>
-        <w:spacing w:after="120"/>
-      </w:pPr>
-      <w:r>
-        <w:t xml:space="preserve">Track-annotated video is required for identity-based counting claims. The final evaluation will report per-frame absolute error, visible-count mean absolute error, unique-session count error, duplicate-track rate, missed-track rate, identity switches where ground truth permits, and class reassignment within a track. Results should be stratified by camera motion, object density, occlusion, scene cuts, and looped or repeated routes.</w:t>
-      </w:r>
-    </w:p>
-    <w:p>
-      <w:pPr>
-        <w:spacing w:after="120"/>
-      </w:pPr>
-      <w:r>
-        <w:t xml:space="preserve">Detection accuracy is necessary but insufficient for count accuracy. A detector can have acceptable image metrics while an unstable tracker repeatedly counts the same item.</w:t>
-      </w:r>
-    </w:p>
-    <w:p>
-      <w:pPr>
-        <w:pStyle w:val="Heading2"/>
-      </w:pPr>
-      <w:r>
-        <w:t xml:space="preserve">6.5 Systems measures</w:t>
-      </w:r>
-    </w:p>
-    <w:p>
-      <w:pPr>
-        <w:spacing w:after="120"/>
-      </w:pPr>
-      <w:r>
-        <w:t xml:space="preserve">Systems evaluation will separate:</w:t>
+        <w:t xml:space="preserve">mAP50 and mAP50–95;</w:t>
       </w:r>
     </w:p>
     <w:p>
@@ -3242,7 +3664,7 @@
         <w:spacing w:after="60"/>
       </w:pPr>
       <w:r>
-        <w:t xml:space="preserve">pure detector-call latency;</w:t>
+        <w:t xml:space="preserve">per-class average precision and support;</w:t>
       </w:r>
     </w:p>
     <w:p>
@@ -3255,7 +3677,7 @@
         <w:spacing w:after="60"/>
       </w:pPr>
       <w:r>
-        <w:t xml:space="preserve">preprocessing, inference, and postprocessing latency;</w:t>
+        <w:t xml:space="preserve">a confusion analysis;</w:t>
       </w:r>
     </w:p>
     <w:p>
@@ -3268,7 +3690,15 @@
         <w:spacing w:after="60"/>
       </w:pPr>
       <w:r>
-        <w:t xml:space="preserve">observed source-to-result throughput;</w:t>
+        <w:t xml:space="preserve">results by object size, lighting, weather, clutter, occlusion, distance, and</w:t>
+      </w:r>
+    </w:p>
+    <w:p>
+      <w:pPr>
+        <w:spacing w:after="120"/>
+      </w:pPr>
+      <w:r>
+        <w:t xml:space="preserve">scene type; and</w:t>
       </w:r>
     </w:p>
     <w:p>
@@ -3281,7 +3711,55 @@
         <w:spacing w:after="60"/>
       </w:pPr>
       <w:r>
-        <w:t xml:space="preserve">first-inference and steady-state latency;</w:t>
+        <w:t xml:space="preserve">human-review rate and correction rate.</w:t>
+      </w:r>
+    </w:p>
+    <w:p>
+      <w:pPr>
+        <w:spacing w:after="120"/>
+      </w:pPr>
+      <w:r>
+        <w:t xml:space="preserve">No class should be advertised as supported if it lacks held-out examples. Aggregate mAP must not conceal poor recall for a hazardous or operationally important minority class.</w:t>
+      </w:r>
+    </w:p>
+    <w:p>
+      <w:pPr>
+        <w:pStyle w:val="Heading2"/>
+      </w:pPr>
+      <w:r>
+        <w:t xml:space="preserve">6.4 Counting measures</w:t>
+      </w:r>
+    </w:p>
+    <w:p>
+      <w:pPr>
+        <w:spacing w:after="120"/>
+      </w:pPr>
+      <w:r>
+        <w:t xml:space="preserve">Track-annotated video is required for identity-based counting claims. The final evaluation will report per-frame absolute error, visible-count mean absolute error, unique-session count error, duplicate-track rate, missed-track rate, identity switches where ground truth permits, and class reassignment within a track. Results should be stratified by camera motion, object density, occlusion, scene cuts, and looped or repeated routes.</w:t>
+      </w:r>
+    </w:p>
+    <w:p>
+      <w:pPr>
+        <w:spacing w:after="120"/>
+      </w:pPr>
+      <w:r>
+        <w:t xml:space="preserve">Detection accuracy is necessary but insufficient for count accuracy. A detector can have acceptable image metrics while an unstable tracker repeatedly counts the same item.</w:t>
+      </w:r>
+    </w:p>
+    <w:p>
+      <w:pPr>
+        <w:pStyle w:val="Heading2"/>
+      </w:pPr>
+      <w:r>
+        <w:t xml:space="preserve">6.5 Systems measures</w:t>
+      </w:r>
+    </w:p>
+    <w:p>
+      <w:pPr>
+        <w:spacing w:after="120"/>
+      </w:pPr>
+      <w:r>
+        <w:t xml:space="preserve">Systems evaluation will separate:</w:t>
       </w:r>
     </w:p>
     <w:p>
@@ -3294,7 +3772,7 @@
         <w:spacing w:after="60"/>
       </w:pPr>
       <w:r>
-        <w:t xml:space="preserve">p50 and p95 latency;</w:t>
+        <w:t xml:space="preserve">pure detector-call latency;</w:t>
       </w:r>
     </w:p>
     <w:p>
@@ -3307,7 +3785,7 @@
         <w:spacing w:after="60"/>
       </w:pPr>
       <w:r>
-        <w:t xml:space="preserve">process, system, and accelerator memory;</w:t>
+        <w:t xml:space="preserve">preprocessing, inference, and postprocessing latency;</w:t>
       </w:r>
     </w:p>
     <w:p>
@@ -3320,7 +3798,7 @@
         <w:spacing w:after="60"/>
       </w:pPr>
       <w:r>
-        <w:t xml:space="preserve">power and energy per processed frame where supported;</w:t>
+        <w:t xml:space="preserve">observed source-to-result throughput;</w:t>
       </w:r>
     </w:p>
     <w:p>
@@ -3333,7 +3811,7 @@
         <w:spacing w:after="60"/>
       </w:pPr>
       <w:r>
-        <w:t xml:space="preserve">temperature, clocks, and throttling state; and</w:t>
+        <w:t xml:space="preserve">first-inference and steady-state latency;</w:t>
       </w:r>
     </w:p>
     <w:p>
@@ -3346,6 +3824,58 @@
         <w:spacing w:after="60"/>
       </w:pPr>
       <w:r>
+        <w:t xml:space="preserve">p50 and p95 latency;</w:t>
+      </w:r>
+    </w:p>
+    <w:p>
+      <w:pPr>
+        <w:pStyle w:val="ListParagraph"/>
+        <w:numPr>
+          <w:ilvl w:val="0"/>
+          <w:numId w:val="2"/>
+        </w:numPr>
+        <w:spacing w:after="60"/>
+      </w:pPr>
+      <w:r>
+        <w:t xml:space="preserve">process, system, and accelerator memory;</w:t>
+      </w:r>
+    </w:p>
+    <w:p>
+      <w:pPr>
+        <w:pStyle w:val="ListParagraph"/>
+        <w:numPr>
+          <w:ilvl w:val="0"/>
+          <w:numId w:val="2"/>
+        </w:numPr>
+        <w:spacing w:after="60"/>
+      </w:pPr>
+      <w:r>
+        <w:t xml:space="preserve">power and energy per processed frame where supported;</w:t>
+      </w:r>
+    </w:p>
+    <w:p>
+      <w:pPr>
+        <w:pStyle w:val="ListParagraph"/>
+        <w:numPr>
+          <w:ilvl w:val="0"/>
+          <w:numId w:val="2"/>
+        </w:numPr>
+        <w:spacing w:after="60"/>
+      </w:pPr>
+      <w:r>
+        <w:t xml:space="preserve">temperature, clocks, and throttling state; and</w:t>
+      </w:r>
+    </w:p>
+    <w:p>
+      <w:pPr>
+        <w:pStyle w:val="ListParagraph"/>
+        <w:numPr>
+          <w:ilvl w:val="0"/>
+          <w:numId w:val="2"/>
+        </w:numPr>
+        <w:spacing w:after="60"/>
+      </w:pPr>
+      <w:r>
         <w:t xml:space="preserve">sustained-run failures, memory growth, camera interruptions, and restart</w:t>
       </w:r>
     </w:p>
@@ -3378,7 +3908,7 @@
         <w:spacing w:after="120"/>
       </w:pPr>
       <w:r>
-        <w:t xml:space="preserve">The provisional engineering target is at least 15 source-to-result frames per second for the declared camera and coexistence condition. For the shared Jetson Orin Nano 8 GB, the preferred incremental detector memory is no more than 1.5 GiB, with a 2.0 GiB initial hard limit and at least 2.0 GiB remaining available memory. These are acceptance criteria, not achieved results.</w:t>
+        <w:t xml:space="preserve">The provisional engineering target is at least 15 source-to-result frames per second for the declared camera and coexistence condition. The preliminary public-model Jetson path reported in Section 7 did not meet this target. For the shared Jetson Orin Nano 8 GB, the preferred incremental detector memory is no more than 1.5 GiB, with a 2.0 GiB initial hard limit and at least 2.0 GiB remaining available memory. The memory-availability condition passed in the reported run, but repeated measurements and a multi-hour endurance test are still required.</w:t>
       </w:r>
     </w:p>
     <w:p>
@@ -3426,7 +3956,7 @@
         <w:spacing w:after="120"/>
       </w:pPr>
       <w:r>
-        <w:t xml:space="preserve">The clean-clone workflow has completed real OmDet-Turbo image inference through the normal launcher, produced normalized detections, written JSON and annotated output, and persisted run and count data in SQLite. The dashboard, API, tracking, review, storage, benchmark, and preparation paths are covered by 73 automated tests at the reported revision.</w:t>
+        <w:t xml:space="preserve">The clean-clone workflow has completed real OmDet-Turbo image inference through the normal launcher, produced normalized detections, written JSON and annotated output, and persisted run and count data in SQLite. The dashboard, API, tracking, review, storage, benchmark, and preparation paths are covered by 76 automated tests at the reported revision.</w:t>
       </w:r>
     </w:p>
     <w:p>
@@ -3439,10 +3969,18 @@
     </w:p>
     <w:p>
       <w:pPr>
+        <w:spacing w:after="120"/>
+      </w:pPr>
+      <w:r>
+        <w:t xml:space="preserve">Specifically, the source annotations included a cigarette, clear plastic bottle, drink can, metal bottle cap, normal paper, plastic items and wrappers, plastic utensils, and unlabeled litter. The demonstration output over-counted metal_can, proposed plastic_bag and tire where those labels were absent, and omitted several annotated small items. This concrete mismatch is why the demonstration is retained as software evidence only.</w:t>
+      </w:r>
+    </w:p>
+    <w:p>
+      <w:pPr>
         <w:pStyle w:val="Heading2"/>
       </w:pPr>
       <w:r>
-        <w:t xml:space="preserve">7.3 Preliminary model-only measurements</w:t>
+        <w:t xml:space="preserve">7.3 Preliminary detector measurements</w:t>
       </w:r>
     </w:p>
     <w:tbl>
@@ -3900,6 +4438,197 @@
                 <w:sz w:val="20"/>
                 <w:szCs w:val="20"/>
               </w:rPr>
+              <w:t xml:space="preserve">Jetson Orin Nano 8 GB, coexistence</w:t>
+            </w:r>
+          </w:p>
+        </w:tc>
+        <w:tc>
+          <w:tcPr>
+            <w:tcW w:type="dxa" w:w="1337"/>
+            <w:tcBorders>
+              <w:top w:val="single" w:color="CCCCCC" w:sz="1"/>
+              <w:left w:val="single" w:color="CCCCCC" w:sz="1"/>
+              <w:bottom w:val="single" w:color="CCCCCC" w:sz="1"/>
+              <w:right w:val="single" w:color="CCCCCC" w:sz="1"/>
+            </w:tcBorders>
+            <w:tcMar>
+              <w:top w:type="dxa" w:w="40"/>
+              <w:left w:type="dxa" w:w="80"/>
+              <w:bottom w:type="dxa" w:w="40"/>
+              <w:right w:type="dxa" w:w="80"/>
+            </w:tcMar>
+          </w:tcPr>
+          <w:p>
+            <w:r>
+              <w:rPr>
+                <w:rFonts w:ascii="Arial" w:cs="Arial" w:eastAsia="Arial" w:hAnsi="Arial"/>
+                <w:sz w:val="20"/>
+                <w:szCs w:val="20"/>
+              </w:rPr>
+              <w:t xml:space="preserve">OmDet-Turbo Tiny, CUDA</w:t>
+            </w:r>
+          </w:p>
+        </w:tc>
+        <w:tc>
+          <w:tcPr>
+            <w:tcW w:type="dxa" w:w="1337"/>
+            <w:tcBorders>
+              <w:top w:val="single" w:color="CCCCCC" w:sz="1"/>
+              <w:left w:val="single" w:color="CCCCCC" w:sz="1"/>
+              <w:bottom w:val="single" w:color="CCCCCC" w:sz="1"/>
+              <w:right w:val="single" w:color="CCCCCC" w:sz="1"/>
+            </w:tcBorders>
+            <w:tcMar>
+              <w:top w:type="dxa" w:w="40"/>
+              <w:left w:type="dxa" w:w="80"/>
+              <w:bottom w:type="dxa" w:w="40"/>
+              <w:right w:type="dxa" w:w="80"/>
+            </w:tcMar>
+          </w:tcPr>
+          <w:p>
+            <w:r>
+              <w:rPr>
+                <w:rFonts w:ascii="Arial" w:cs="Arial" w:eastAsia="Arial" w:hAnsi="Arial"/>
+                <w:sz w:val="20"/>
+                <w:szCs w:val="20"/>
+              </w:rPr>
+              <w:t xml:space="preserve">50 repeated images after 10 warm-up calls</w:t>
+            </w:r>
+          </w:p>
+        </w:tc>
+        <w:tc>
+          <w:tcPr>
+            <w:tcW w:type="dxa" w:w="1337"/>
+            <w:tcBorders>
+              <w:top w:val="single" w:color="CCCCCC" w:sz="1"/>
+              <w:left w:val="single" w:color="CCCCCC" w:sz="1"/>
+              <w:bottom w:val="single" w:color="CCCCCC" w:sz="1"/>
+              <w:right w:val="single" w:color="CCCCCC" w:sz="1"/>
+            </w:tcBorders>
+            <w:tcMar>
+              <w:top w:type="dxa" w:w="40"/>
+              <w:left w:type="dxa" w:w="80"/>
+              <w:bottom w:type="dxa" w:w="40"/>
+              <w:right w:type="dxa" w:w="80"/>
+            </w:tcMar>
+          </w:tcPr>
+          <w:p>
+            <w:r>
+              <w:rPr>
+                <w:rFonts w:ascii="Arial" w:cs="Arial" w:eastAsia="Arial" w:hAnsi="Arial"/>
+                <w:sz w:val="20"/>
+                <w:szCs w:val="20"/>
+              </w:rPr>
+              <w:t xml:space="preserve">5.54 FPS</w:t>
+            </w:r>
+          </w:p>
+        </w:tc>
+        <w:tc>
+          <w:tcPr>
+            <w:tcW w:type="dxa" w:w="1337"/>
+            <w:tcBorders>
+              <w:top w:val="single" w:color="CCCCCC" w:sz="1"/>
+              <w:left w:val="single" w:color="CCCCCC" w:sz="1"/>
+              <w:bottom w:val="single" w:color="CCCCCC" w:sz="1"/>
+              <w:right w:val="single" w:color="CCCCCC" w:sz="1"/>
+            </w:tcBorders>
+            <w:tcMar>
+              <w:top w:type="dxa" w:w="40"/>
+              <w:left w:type="dxa" w:w="80"/>
+              <w:bottom w:type="dxa" w:w="40"/>
+              <w:right w:type="dxa" w:w="80"/>
+            </w:tcMar>
+          </w:tcPr>
+          <w:p>
+            <w:r>
+              <w:rPr>
+                <w:rFonts w:ascii="Arial" w:cs="Arial" w:eastAsia="Arial" w:hAnsi="Arial"/>
+                <w:sz w:val="20"/>
+                <w:szCs w:val="20"/>
+              </w:rPr>
+              <w:t xml:space="preserve">174.30 ms</w:t>
+            </w:r>
+          </w:p>
+        </w:tc>
+        <w:tc>
+          <w:tcPr>
+            <w:tcW w:type="dxa" w:w="1337"/>
+            <w:tcBorders>
+              <w:top w:val="single" w:color="CCCCCC" w:sz="1"/>
+              <w:left w:val="single" w:color="CCCCCC" w:sz="1"/>
+              <w:bottom w:val="single" w:color="CCCCCC" w:sz="1"/>
+              <w:right w:val="single" w:color="CCCCCC" w:sz="1"/>
+            </w:tcBorders>
+            <w:tcMar>
+              <w:top w:type="dxa" w:w="40"/>
+              <w:left w:type="dxa" w:w="80"/>
+              <w:bottom w:type="dxa" w:w="40"/>
+              <w:right w:type="dxa" w:w="80"/>
+            </w:tcMar>
+          </w:tcPr>
+          <w:p>
+            <w:r>
+              <w:rPr>
+                <w:rFonts w:ascii="Arial" w:cs="Arial" w:eastAsia="Arial" w:hAnsi="Arial"/>
+                <w:sz w:val="20"/>
+                <w:szCs w:val="20"/>
+              </w:rPr>
+              <w:t xml:space="preserve">175.65 ms</w:t>
+            </w:r>
+          </w:p>
+        </w:tc>
+        <w:tc>
+          <w:tcPr>
+            <w:tcW w:type="dxa" w:w="1337"/>
+            <w:tcBorders>
+              <w:top w:val="single" w:color="CCCCCC" w:sz="1"/>
+              <w:left w:val="single" w:color="CCCCCC" w:sz="1"/>
+              <w:bottom w:val="single" w:color="CCCCCC" w:sz="1"/>
+              <w:right w:val="single" w:color="CCCCCC" w:sz="1"/>
+            </w:tcBorders>
+            <w:tcMar>
+              <w:top w:type="dxa" w:w="40"/>
+              <w:left w:type="dxa" w:w="80"/>
+              <w:bottom w:type="dxa" w:w="40"/>
+              <w:right w:type="dxa" w:w="80"/>
+            </w:tcMar>
+          </w:tcPr>
+          <w:p>
+            <w:r>
+              <w:rPr>
+                <w:rFonts w:ascii="Arial" w:cs="Arial" w:eastAsia="Arial" w:hAnsi="Arial"/>
+                <w:sz w:val="20"/>
+                <w:szCs w:val="20"/>
+              </w:rPr>
+              <w:t xml:space="preserve">0.70 GiB peak allocated</w:t>
+            </w:r>
+          </w:p>
+        </w:tc>
+      </w:tr>
+      <w:tr>
+        <w:tc>
+          <w:tcPr>
+            <w:tcW w:type="dxa" w:w="1337"/>
+            <w:tcBorders>
+              <w:top w:val="single" w:color="CCCCCC" w:sz="1"/>
+              <w:left w:val="single" w:color="CCCCCC" w:sz="1"/>
+              <w:bottom w:val="single" w:color="CCCCCC" w:sz="1"/>
+              <w:right w:val="single" w:color="CCCCCC" w:sz="1"/>
+            </w:tcBorders>
+            <w:tcMar>
+              <w:top w:type="dxa" w:w="40"/>
+              <w:left w:type="dxa" w:w="80"/>
+              <w:bottom w:type="dxa" w:w="40"/>
+              <w:right w:type="dxa" w:w="80"/>
+            </w:tcMar>
+          </w:tcPr>
+          <w:p>
+            <w:r>
+              <w:rPr>
+                <w:rFonts w:ascii="Arial" w:cs="Arial" w:eastAsia="Arial" w:hAnsi="Arial"/>
+                <w:sz w:val="20"/>
+                <w:szCs w:val="20"/>
+              </w:rPr>
               <w:t xml:space="preserve">Apple silicon, MPS</w:t>
             </w:r>
           </w:p>
@@ -4078,15 +4807,15 @@
         <w:spacing w:after="120"/>
       </w:pPr>
       <w:r>
-        <w:t xml:space="preserve">The T4 measurement used a repeated image and measured the detector benchmark path rather than sustained video capture, annotation rendering, database writing, and dashboard delivery. The original output was produced on the AWS instance; the public repository currently retains a transcribed evidence record and the documented values, not the original remote JSON file. The Apple measurement is retained as a repository JSON artifact. Neither result measures accuracy.</w:t>
-      </w:r>
-    </w:p>
-    <w:p>
-      <w:pPr>
-        <w:spacing w:after="120"/>
-      </w:pPr>
-      <w:r>
-        <w:t xml:space="preserve">The T4 result demonstrates that the current public-model path can exceed the provisional 15 FPS engineering target in one discrete-GPU, model-only condition. It must not be generalized to an 8 GB Jetson, an AMD device, or the full application.</w:t>
+        <w:t xml:space="preserve">The T4 and Jetson measurements used a repeated image and measured the detector benchmark path rather than sustained video capture, annotation rendering, database writing, and dashboard delivery. The original T4 output was produced on the AWS instance; the public repository currently retains a transcribed evidence record and the documented values, not the original remote JSON file. The Jetson and Apple measurements are retained as repository JSON artifacts. None of these measurements evaluates accuracy.</w:t>
+      </w:r>
+    </w:p>
+    <w:p>
+      <w:pPr>
+        <w:spacing w:after="120"/>
+      </w:pPr>
+      <w:r>
+        <w:t xml:space="preserve">The T4 result demonstrates that the current public-model path can exceed the provisional 15 FPS engineering target in one discrete-GPU, model-only condition. The Jetson result demonstrates compatibility and bounded steady-state detector execution, but at 5.54 FPS it did not meet that target. Neither repeated-image result establishes full-application or accuracy performance.</w:t>
       </w:r>
     </w:p>
     <w:p>
@@ -4094,23 +4823,47 @@
         <w:pStyle w:val="Heading2"/>
       </w:pPr>
       <w:r>
-        <w:t xml:space="preserve">7.4 Read-only Jetson inventory</w:t>
-      </w:r>
-    </w:p>
-    <w:p>
-      <w:pPr>
-        <w:spacing w:after="120"/>
-      </w:pPr>
-      <w:r>
-        <w:t xml:space="preserve">A read-only inventory identified the intended target as a Jetson Orin Nano Engineering Reference Developer Kit Super with Ubuntu 22.04.5, JetPack 6.2.3, L4T 36.5.2, TensorRT 10.3.0, Python 3.10.12, and 7.4 GiB physical memory. At capture time, 4.5 GiB was available, no /dev/video* camera was present, and active local LLM, application, and development services were observed.</w:t>
-      </w:r>
-    </w:p>
-    <w:p>
-      <w:pPr>
-        <w:spacing w:after="120"/>
-      </w:pPr>
-      <w:r>
-        <w:t xml:space="preserve">No package was installed, no service was stopped, and no configuration was changed. The inventory confirms platform constraints only. Jetson inference, accuracy, throughput, memory, power, thermal, and sustained coexistence tests remain pending an authorized test window.</w:t>
+        <w:t xml:space="preserve">7.4 Jetson inventory and coexistence validation</w:t>
+      </w:r>
+    </w:p>
+    <w:p>
+      <w:pPr>
+        <w:spacing w:after="120"/>
+      </w:pPr>
+      <w:r>
+        <w:t xml:space="preserve">An inventory identified the intended target as a Jetson Orin Nano Engineering Reference Developer Kit Super with Ubuntu 22.04.5, JetPack 6.2.3, L4T 36.5.2, TensorRT 10.3.0, Python 3.10.12, and 7.4 GiB physical memory. At capture time, 4.5 GiB was available, no /dev/video* camera was present, and active local LLM, application, and development services were observed.</w:t>
+      </w:r>
+    </w:p>
+    <w:p>
+      <w:pPr>
+        <w:spacing w:after="120"/>
+      </w:pPr>
+      <w:r>
+        <w:t xml:space="preserve">The authorized test used a dedicated data directory and a digest-pinned, 4 GiB-limited community L4T PyTorch container. It did not change system packages, system Python, power mode, clocks, or existing services. The container supplied Python 3.10.12, PyTorch 2.4.0, torchvision 0.19.0a0+48b1edf, Transformers 4.57.6, and TensorRT 10.4.0. The use of a community image is a recorded supply-chain limitation rather than an endorsed production base.</w:t>
+      </w:r>
+    </w:p>
+    <w:p>
+      <w:pPr>
+        <w:spacing w:after="120"/>
+      </w:pPr>
+      <w:r>
+        <w:t xml:space="preserve">After an initial 120-frame smoke test, the normal launcher processed all 3,622 frames of the 120.85-second attributed recycling demonstration in 733.54 seconds. Source-to-result throughput was 4.94 FPS and mean detector-call latency was 178.60 ms. The run completed tracking, annotated MP4 creation, JSONL and summary output, and SQLite persistence. tegrastats recorded 4,851 MB peak total Jetson RAM use, 63.86 °C mean and 66.31 °C peak GPU temperature, 14.53 W mean board input power, and 15.81 W peak board input power during telemetry. Swap decreased from 158 MiB before the run to 147 MiB after it. Board power includes the full Jetson and co-resident services.</w:t>
+      </w:r>
+    </w:p>
+    <w:p>
+      <w:pPr>
+        <w:spacing w:after="120"/>
+      </w:pPr>
+      <w:r>
+        <w:t xml:space="preserve">A separate loopback-only dashboard smoke test returned the browser interface with security headers, started and completed a 30-frame CUDA stream, served an annotated JPEG, and exposed the persisted run through the counts API. Its 1.77 FPS source-to-result result included lazy model loading and is reported only as functional UI/API evidence.</w:t>
+      </w:r>
+    </w:p>
+    <w:p>
+      <w:pPr>
+        <w:spacing w:after="120"/>
+      </w:pPr>
+      <w:r>
+        <w:t xml:space="preserve">The public demonstration video does not provide labels for the project's operational taxonomy. Its detections and counts are therefore not accuracy or count-error results. The run establishes bounded full-file stability, not repeatability, multi-hour endurance, thermal-throttling acceptance, or production readiness.</w:t>
       </w:r>
     </w:p>
     <w:p>
@@ -4449,7 +5202,7 @@
                 <w:sz w:val="20"/>
                 <w:szCs w:val="20"/>
               </w:rPr>
-              <w:t xml:space="preserve">Target-domain detection/classification accuracy</w:t>
+              <w:t xml:space="preserve">Jetson Orin 8 GB detector and 3,622-frame full workflow</w:t>
             </w:r>
           </w:p>
         </w:tc>
@@ -4476,7 +5229,7 @@
                 <w:sz w:val="20"/>
                 <w:szCs w:val="20"/>
               </w:rPr>
-              <w:t xml:space="preserve">pending representative labeled data</w:t>
+              <w:t xml:space="preserve">preliminary measured coexistence and bounded stability evidence; 15 FPS target not met</w:t>
             </w:r>
           </w:p>
         </w:tc>
@@ -4505,7 +5258,7 @@
                 <w:sz w:val="20"/>
                 <w:szCs w:val="20"/>
               </w:rPr>
-              <w:t xml:space="preserve">Video counting accuracy</w:t>
+              <w:t xml:space="preserve">Target-domain detection/classification accuracy</w:t>
             </w:r>
           </w:p>
         </w:tc>
@@ -4532,7 +5285,7 @@
                 <w:sz w:val="20"/>
                 <w:szCs w:val="20"/>
               </w:rPr>
-              <w:t xml:space="preserve">pending track-annotated video</w:t>
+              <w:t xml:space="preserve">pending representative labeled data</w:t>
             </w:r>
           </w:p>
         </w:tc>
@@ -4561,7 +5314,7 @@
                 <w:sz w:val="20"/>
                 <w:szCs w:val="20"/>
               </w:rPr>
-              <w:t xml:space="preserve">Jetson Orin 8 GB inference, power, thermals, and sustained stability</w:t>
+              <w:t xml:space="preserve">Video counting accuracy</w:t>
             </w:r>
           </w:p>
         </w:tc>
@@ -4588,7 +5341,7 @@
                 <w:sz w:val="20"/>
                 <w:szCs w:val="20"/>
               </w:rPr>
-              <w:t xml:space="preserve">pending authorized test</w:t>
+              <w:t xml:space="preserve">pending track-annotated video</w:t>
             </w:r>
           </w:p>
         </w:tc>
@@ -4617,7 +5370,7 @@
                 <w:sz w:val="20"/>
                 <w:szCs w:val="20"/>
               </w:rPr>
-              <w:t xml:space="preserve">AMD ROCm / Strix Halo inference and sustained performance</w:t>
+              <w:t xml:space="preserve">Jetson repeated runs, multi-hour endurance, and production acceptance</w:t>
             </w:r>
           </w:p>
         </w:tc>
@@ -4644,7 +5397,7 @@
                 <w:sz w:val="20"/>
                 <w:szCs w:val="20"/>
               </w:rPr>
-              <w:t xml:space="preserve">pending target-device test</w:t>
+              <w:t xml:space="preserve">pending</w:t>
             </w:r>
           </w:p>
         </w:tc>
@@ -4673,6 +5426,62 @@
                 <w:sz w:val="20"/>
                 <w:szCs w:val="20"/>
               </w:rPr>
+              <w:t xml:space="preserve">AMD ROCm / Strix Halo inference and sustained performance</w:t>
+            </w:r>
+          </w:p>
+        </w:tc>
+        <w:tc>
+          <w:tcPr>
+            <w:tcW w:type="dxa" w:w="4680"/>
+            <w:tcBorders>
+              <w:top w:val="single" w:color="CCCCCC" w:sz="1"/>
+              <w:left w:val="single" w:color="CCCCCC" w:sz="1"/>
+              <w:bottom w:val="single" w:color="CCCCCC" w:sz="1"/>
+              <w:right w:val="single" w:color="CCCCCC" w:sz="1"/>
+            </w:tcBorders>
+            <w:tcMar>
+              <w:top w:type="dxa" w:w="40"/>
+              <w:left w:type="dxa" w:w="80"/>
+              <w:bottom w:type="dxa" w:w="40"/>
+              <w:right w:type="dxa" w:w="80"/>
+            </w:tcMar>
+          </w:tcPr>
+          <w:p>
+            <w:r>
+              <w:rPr>
+                <w:rFonts w:ascii="Arial" w:cs="Arial" w:eastAsia="Arial" w:hAnsi="Arial"/>
+                <w:sz w:val="20"/>
+                <w:szCs w:val="20"/>
+              </w:rPr>
+              <w:t xml:space="preserve">pending target-device test</w:t>
+            </w:r>
+          </w:p>
+        </w:tc>
+      </w:tr>
+      <w:tr>
+        <w:tc>
+          <w:tcPr>
+            <w:tcW w:type="dxa" w:w="4680"/>
+            <w:tcBorders>
+              <w:top w:val="single" w:color="CCCCCC" w:sz="1"/>
+              <w:left w:val="single" w:color="CCCCCC" w:sz="1"/>
+              <w:bottom w:val="single" w:color="CCCCCC" w:sz="1"/>
+              <w:right w:val="single" w:color="CCCCCC" w:sz="1"/>
+            </w:tcBorders>
+            <w:tcMar>
+              <w:top w:type="dxa" w:w="40"/>
+              <w:left w:type="dxa" w:w="80"/>
+              <w:bottom w:type="dxa" w:w="40"/>
+              <w:right w:type="dxa" w:w="80"/>
+            </w:tcMar>
+          </w:tcPr>
+          <w:p>
+            <w:r>
+              <w:rPr>
+                <w:rFonts w:ascii="Arial" w:cs="Arial" w:eastAsia="Arial" w:hAnsi="Arial"/>
+                <w:sz w:val="20"/>
+                <w:szCs w:val="20"/>
+              </w:rPr>
               <w:t xml:space="preserve">Cleanup or sorting operational benefit</w:t>
             </w:r>
           </w:p>
@@ -4756,7 +5565,7 @@
         <w:spacing w:after="120"/>
       </w:pPr>
       <w:r>
-        <w:t xml:space="preserve">The Jetson inventory demonstrates another practical constraint: an edge device may already host valuable services. A benchmark that stops the existing workload or consumes swap can answer a laboratory question while failing the deployment requirement. Coexistence must be part of the declared condition, and exclusive benchmarking should be labeled separately if it is later authorized.</w:t>
+        <w:t xml:space="preserve">The Jetson run demonstrates another practical constraint: an edge device may already host valuable services. The existing workload remained active, at least 2.54 GiB system memory remained available during the detector benchmark, and the video run did not increase swap. This coexistence result is more representative than an exclusive laboratory run, but it also shows that the eager public-model path is below the declared 15 FPS goal and requires optimization before high-rate use.</w:t>
       </w:r>
     </w:p>
     <w:p>
@@ -4788,7 +5597,7 @@
         <w:spacing w:after="120"/>
       </w:pPr>
       <w:r>
-        <w:t xml:space="preserve">Second, the preliminary benchmarks use repeated images. They reduce source variation and do not include all full-pipeline costs. Sample counts are modest, and the remote T4 JSON artifact was not copied back into the repository before the instance output was summarized.</w:t>
+        <w:t xml:space="preserve">Second, the model benchmarks use repeated images. They reduce source variation and do not include all full-pipeline costs. Sample counts are modest, and the remote T4 JSON artifact was not copied back into the repository before the instance output was summarized. The Jetson result adds a complete 3,622-frame pipeline run, but it remains a single unlabelled source and one device run.</w:t>
       </w:r>
     </w:p>
     <w:p>
@@ -4812,15 +5621,23 @@
         <w:spacing w:after="120"/>
       </w:pPr>
       <w:r>
-        <w:t xml:space="preserve">Fifth, Jetson and AMD execution paths are documented but not yet empirically validated. The paper does not claim that the measured T4 rate will transfer to an 8 GB unified-memory platform.</w:t>
-      </w:r>
-    </w:p>
-    <w:p>
-      <w:pPr>
-        <w:spacing w:after="120"/>
-      </w:pPr>
-      <w:r>
-        <w:t xml:space="preserve">Sixth, no field study has yet measured whether the system improves route planning, worker productivity, recovery rate, separation quality, or cleanup outcomes. Those benefits remain hypotheses for later operational evaluation.</w:t>
+        <w:t xml:space="preserve">Fifth, the Jetson execution path has one preliminary coexistence validation, not the repeated/endurance evidence required for production acceptance. Its community container base requires a separate supply-chain decision. AMD execution remains untested.</w:t>
+      </w:r>
+    </w:p>
+    <w:p>
+      <w:pPr>
+        <w:spacing w:after="120"/>
+      </w:pPr>
+      <w:r>
+        <w:t xml:space="preserve">Sixth, the author developed the system and performed the reported validation. No independent team has yet reproduced the clean-clone workflow or audited the measurements. An external reproduction log on another supported host is a required credibility milestone.</w:t>
+      </w:r>
+    </w:p>
+    <w:p>
+      <w:pPr>
+        <w:spacing w:after="120"/>
+      </w:pPr>
+      <w:r>
+        <w:t xml:space="preserve">Seventh, no field study has yet measured whether the system improves route planning, worker productivity, recovery rate, separation quality, or cleanup outcomes. Those benefits remain hypotheses for later operational evaluation.</w:t>
       </w:r>
     </w:p>
     <w:p>
@@ -4868,7 +5685,7 @@
         <w:spacing w:after="120"/>
       </w:pPr>
       <w:r>
-        <w:t xml:space="preserve">Edge processing can reduce continuous raw-video transmission but still consumes electricity and hardware. Final evaluation should report power and energy per processed frame where feasible and should select the least complex configuration that satisfies the use case. Environmental benefit should not be inferred from detection metrics alone.</w:t>
+        <w:t xml:space="preserve">Edge processing can reduce continuous raw-video transmission but still consumes electricity and hardware. Final evaluation should report power and energy per processed frame where feasible and should select the least complex configuration that satisfies the use case. Environmental benefit should not be inferred from detection metrics alone. The preliminary Jetson test reports whole-board power, not detector-only energy. Energy per frame is intentionally withheld until run and power timestamps are synchronized tightly enough to separate startup, inference, co-resident workloads, and cooldown.</w:t>
       </w:r>
     </w:p>
     <w:p>
@@ -4900,15 +5717,15 @@
         <w:spacing w:after="120"/>
       </w:pPr>
       <w:r>
-        <w:t xml:space="preserve">This paper describes version 0.10.1 at commit:</w:t>
-      </w:r>
-    </w:p>
-    <w:p>
-      <w:pPr>
-        <w:spacing w:after="120"/>
-      </w:pPr>
-      <w:r>
-        <w:t xml:space="preserve">0624677b72cf1d16b59a335b78d9003f2b479786</w:t>
+        <w:t xml:space="preserve">This paper describes and reports measurements from version 0.10.1 at commit:</w:t>
+      </w:r>
+    </w:p>
+    <w:p>
+      <w:pPr>
+        <w:spacing w:after="120"/>
+      </w:pPr>
+      <w:r>
+        <w:t xml:space="preserve">756fa2ae0b8686bb4b97940911710dc73f8efd90</w:t>
       </w:r>
     </w:p>
     <w:p>
@@ -4924,7 +5741,7 @@
         <w:spacing w:after="120"/>
       </w:pPr>
       <w:r>
-        <w:t xml:space="preserve">Preliminary evidence records accompany this manuscript under paper/evidence/. Runtime-generated records normally appear under reports/generated/, and the SQLite store appears under state/litter-edge.db. Transient media, private data, credentials, and raw device inventories are excluded from version control.</w:t>
+        <w:t xml:space="preserve">Preliminary evidence records accompany this manuscript under paper/evidence/, including the raw Jetson benchmark JSON, run summary, tegrastats captures, checksums, and interpretation boundary. Runtime-generated records normally appear under reports/generated/, and the SQLite store appears under state/litter-edge.db. Transient media, private data, credentials, and raw device inventories are excluded from version control.</w:t>
       </w:r>
     </w:p>
     <w:p>
@@ -4948,15 +5765,15 @@
         <w:spacing w:after="120"/>
       </w:pPr>
       <w:r>
-        <w:t xml:space="preserve">The implementation distinguishes visible observations, unique tracked objects, and independently confirmed collections; stores durable offline evidence; supports human correction; and prevents direct perception-to-actuation coupling. Preliminary validation confirms a functioning codebase and provides bounded T4 and Apple-silicon model-only measurements. It does not yet support claims of target-domain accuracy or Jetson/AMD production performance.</w:t>
-      </w:r>
-    </w:p>
-    <w:p>
-      <w:pPr>
-        <w:spacing w:after="120"/>
-      </w:pPr>
-      <w:r>
-        <w:t xml:space="preserve">The next empirical work is to collect and annotate representative field and sorting footage, freeze grouped development and test partitions, establish inter-annotator quality, select and freeze one operating configuration, evaluate per-class detection and count error, and complete authorized sustained tests on Jetson Orin 8 GB and AMD hardware. A subsequent paper revision should replace pending evidence with traceable accuracy, power, thermal, reliability, and operational-outcome results.</w:t>
+        <w:t xml:space="preserve">The implementation distinguishes visible observations, unique tracked objects, and independently confirmed collections; stores durable offline evidence; supports human correction; and prevents direct perception-to-actuation coupling. Preliminary validation confirms a functioning codebase, bounded T4 and Apple-silicon model measurements, and an end-to-end Jetson coexistence run covering video, storage, dashboard, and API behavior. The Jetson public-model path is functional but did not meet the provisional 15 FPS target. The paper does not yet support claims of target-domain accuracy, counting accuracy, endurance, AMD performance, or production readiness.</w:t>
+      </w:r>
+    </w:p>
+    <w:p>
+      <w:pPr>
+        <w:spacing w:after="120"/>
+      </w:pPr>
+      <w:r>
+        <w:t xml:space="preserve">The next empirical work is to collect and annotate representative field and sorting footage, freeze grouped development and test partitions, establish inter-annotator quality, select and freeze one operating configuration, evaluate per-class detection and count error, and complete authorized sustained tests on Jetson Orin 8 GB and AMD hardware. Jetson work should first optimize the runtime, repeat the measured conditions, and complete a multi-hour endurance test. A subsequent paper revision should replace pending evidence with traceable accuracy, reliability, and operational-outcome results.</w:t>
       </w:r>
     </w:p>
     <w:p>
@@ -5221,6 +6038,30 @@
       </w:pPr>
       <w:r>
         <w:t xml:space="preserve">[21] OWASP Foundation. (2021). Application Security Verification Standard 4.0.3. https://owasp.org/www-project-application-security-verification-standard/</w:t>
+      </w:r>
+    </w:p>
+    <w:p>
+      <w:pPr>
+        <w:spacing w:after="120"/>
+      </w:pPr>
+      <w:r>
+        <w:t xml:space="preserve">[22] Litterati. (2026). Analyze: Identify litter trends and measure impact. https://www.litterati.org/analyze</w:t>
+      </w:r>
+    </w:p>
+    <w:p>
+      <w:pPr>
+        <w:spacing w:after="120"/>
+      </w:pPr>
+      <w:r>
+        <w:t xml:space="preserve">[23] United States Environmental Protection Agency. (2023). EPA SBIR Supports Technology to Improve Recycling. https://www.epa.gov/sbir/epa-sbir-supports-technology-improve-recycling</w:t>
+      </w:r>
+    </w:p>
+    <w:p>
+      <w:pPr>
+        <w:spacing w:after="120"/>
+      </w:pPr>
+      <w:r>
+        <w:t xml:space="preserve">[24] AMP. (2026). AMP Vision: Real-Time Material Characterization. https://ampsortation.com/vision-system</w:t>
       </w:r>
     </w:p>
     <w:p>
@@ -5252,7 +6093,7 @@
       </w:r>
       <w:r>
         <w:br/>
-        <w:t xml:space="preserve">git checkout 0624677b72cf1d16b59a335b78d9003f2b479786</w:t>
+        <w:t xml:space="preserve">git checkout 756fa2ae0b8686bb4b97940911710dc73f8efd90</w:t>
       </w:r>
       <w:r>
         <w:br/>
@@ -5530,6 +6371,14 @@
       </w:pPr>
       <w:r>
         <w:t xml:space="preserve">⚠️ AI &amp; Data Notice: All output is AI-generated and must be independently verified before sharing with customers or taking action.</w:t>
+      </w:r>
+    </w:p>
+    <w:p>
+      <w:pPr>
+        <w:spacing w:after="120"/>
+      </w:pPr>
+      <w:r>
+        <w:t xml:space="preserve">This banner discloses the use of an AI-assisted document-generation workflow. It does not replace author responsibility, peer review, source verification, or the scientific limitations stated in the manuscript. A venue-specific version should follow the destination venue's disclosure policy while retaining an accurate authorship and tool-use statement.</w:t>
       </w:r>
     </w:p>
     <w:sectPr>

</xml_diff>

<commit_message>
Finalize publication review for preprint 1.6
</commit_message>
<xml_diff>
--- a/paper/Edge_Litter_Detection_Preprint.docx
+++ b/paper/Edge_Litter_Detection_Preprint.docx
@@ -46,7 +46,7 @@
           <w:sz w:val="18"/>
           <w:szCs w:val="18"/>
         </w:rPr>
-        <w:t xml:space="preserve">Preprint version 1.5 — journal format and publication figures</w:t>
+        <w:t xml:space="preserve">Preprint version 1.6</w:t>
       </w:r>
     </w:p>
     <w:p>
@@ -93,25 +93,25 @@
         <w:jc w:val="both"/>
       </w:pPr>
       <w:r>
-        <w:t xml:space="preserve">Litter monitoring is often treated as an object-detection exercise, although a deployable solution must also ingest operational video, maintain stable class contracts, avoid repeated counting, persist evidence, support human review, and integrate safely with collection or sorting workflows. This paper presents an open and reproducible edge-AI software architecture that addresses those requirements as one portable application. The software accepts cameras, images, recorded video, HTTP media, and RTSP streams; normalizes public or custom detector output; applies duplicate suppression and class-stabilized tracking; reports visible and unique-session counts; and stores auditable SQLite and JSON evidence. A browser interface exposes annotated video, counts, review tasks, and source controls. The default 16-class operational taxonomy supports human review and configurable separation guidance.</w:t>
-      </w:r>
-    </w:p>
-    <w:p>
-      <w:pPr>
-        <w:spacing w:after="80"/>
-        <w:jc w:val="both"/>
-      </w:pPr>
-      <w:r>
-        <w:t xml:space="preserve">The detector is interchangeable rather than the product boundary. A clean clone runs with the public OmDet-Turbo Tiny open-vocabulary checkpoint, while a validated litter-specific checkpoint can be introduced later without changing downstream contracts. A preliminary zero-shot evaluation on a deterministic, source-grouped TACO test partition of 212 images and 680 mapped annotations measured 7.65% COCO mAP50–95, 10.16% mAP50, and 7.49% micro F1 at the frozen operating point. This result establishes an accuracy signal and also shows that the unadapted public checkpoint is a functional bootstrap, not a production-accepted litter model.</w:t>
-      </w:r>
-    </w:p>
-    <w:p>
-      <w:pPr>
-        <w:spacing w:after="80"/>
-        <w:jc w:val="both"/>
-      </w:pPr>
-      <w:r>
-        <w:t xml:space="preserve">Engineering validation confirms installation, inference, persistence, automated checks, and execution on NVIDIA CUDA, Apple silicon, and an NVIDIA Jetson Orin Nano 8 GB. A prior complete 3,622-frame Jetson run measured 4.94 source-to-result FPS. Three subsequent 300-frame full-pipeline repetitions, each after 10 warm-up calls, measured 5.188 ± 0.010 FPS. Model forward time accounted for 71.10% of wall time, detector preprocessing 13.69%, and annotation/output 10.59%; tracking, JSONL, and SQLite together accounted for less than 1%. The provisional 15 FPS target was not met. These measurements do not establish target-domain accuracy, counting error, endurance, AMD performance, or production readiness. The contribution is therefore the reusable architecture, explicit count semantics, safety and security boundary, traceable preliminary evidence, and a protocol for the remaining empirical work.</w:t>
+        <w:t xml:space="preserve">Deployable litter monitoring requires more than object detection: it must ingest operational video, maintain stable class contracts, avoid repeated counting, persist evidence, support human review, and integrate safely with collection or sorting workflows. This paper presents an open and reproducible edge-AI software architecture that packages these functions as one portable application. It accepts cameras, images, recorded video, HTTP media, and RTSP streams; normalizes public or custom detector output; performs duplicate suppression and class-stabilized tracking; reports visible and unique-session counts; stores auditable SQLite and JSON evidence; and provides a browser interface for annotated video, counts, review, and source control.</w:t>
+      </w:r>
+    </w:p>
+    <w:p>
+      <w:pPr>
+        <w:spacing w:after="80"/>
+        <w:jc w:val="both"/>
+      </w:pPr>
+      <w:r>
+        <w:t xml:space="preserve">The detector is interchangeable rather than the product boundary. A clean clone uses a pinned public OmDet-Turbo Tiny checkpoint, while a validated litter-specific checkpoint can later replace it without changing downstream contracts. On a deterministic source-grouped TACO test partition of 212 images and 680 mapped annotations, the public checkpoint measured 7.65% COCO mAP50–95, 10.16% mAP50, and 7.49% micro F1 at a frozen operating point. The result identifies the checkpoint as a functional bootstrap, not a production-accepted litter classifier.</w:t>
+      </w:r>
+    </w:p>
+    <w:p>
+      <w:pPr>
+        <w:spacing w:after="80"/>
+        <w:jc w:val="both"/>
+      </w:pPr>
+      <w:r>
+        <w:t xml:space="preserve">Engineering validation covers installation, inference, persistence, automated checks, and execution on NVIDIA CUDA, Apple silicon, and a Jetson Orin Nano 8 GB. A complete 3,622-frame Jetson run measured 4.94 source-to-result FPS; three warmed 300-frame full-pipeline repetitions measured 5.188 ± 0.010 FPS. Model forward, preprocessing, and annotation/output accounted for 95.38% of wall time, whereas tracking, JSONL, and SQLite together accounted for less than 1%. The provisional 15 FPS target was not met. The contribution is therefore a reusable architecture with explicit count semantics, safety and security boundaries, traceable preliminary evidence, and a protocol for target-domain accuracy, counting, endurance, and hardware acceptance work that remains pending.</w:t>
       </w:r>
     </w:p>
     <w:p>
@@ -983,7 +983,7 @@
           <wp:inline distT="0" distB="0" distL="0" distR="0">
             <wp:extent cx="5715000" cy="2857500"/>
             <wp:effectExtent t="0" r="0" b="0" l="0"/>
-            <wp:docPr id="1" name="figure-1-system-architecture.png" descr="End-to-end system architecture" title="End-to-end system architecture"/>
+            <wp:docPr id="1" name="figure-1-system-architecture.svg" descr="End-to-end system architecture" title="End-to-end system architecture"/>
             <wp:cNvGraphicFramePr>
               <a:graphicFrameLocks xmlns:a="http://schemas.openxmlformats.org/drawingml/2006/main" noChangeAspect="1"/>
             </wp:cNvGraphicFramePr>
@@ -997,7 +997,13 @@
                     </pic:cNvPicPr>
                   </pic:nvPicPr>
                   <pic:blipFill>
-                    <a:blip r:embed="rId7" cstate="none"/>
+                    <a:blip r:embed="rId8" cstate="none">
+                      <a:extLst>
+                        <a:ext uri="{96DAC541-7B7A-43D3-8B79-37D633B846F1}">
+                          <asvg:svgBlip xmlns:asvg="http://schemas.microsoft.com/office/drawing/2016/SVG/main" r:embed="rId7"/>
+                        </a:ext>
+                      </a:extLst>
+                    </a:blip>
                     <a:srcRect/>
                     <a:stretch>
                       <a:fillRect/>
@@ -2911,7 +2917,7 @@
           <wp:inline distT="0" distB="0" distL="0" distR="0">
             <wp:extent cx="5715000" cy="2047875"/>
             <wp:effectExtent t="0" r="0" b="0" l="0"/>
-            <wp:docPr id="1" name="figure-2-count-semantics.png" descr="Count semantics" title="Count semantics"/>
+            <wp:docPr id="1" name="figure-2-count-semantics.svg" descr="Count semantics" title="Count semantics"/>
             <wp:cNvGraphicFramePr>
               <a:graphicFrameLocks xmlns:a="http://schemas.openxmlformats.org/drawingml/2006/main" noChangeAspect="1"/>
             </wp:cNvGraphicFramePr>
@@ -2925,7 +2931,13 @@
                     </pic:cNvPicPr>
                   </pic:nvPicPr>
                   <pic:blipFill>
-                    <a:blip r:embed="rId8" cstate="none"/>
+                    <a:blip r:embed="rId10" cstate="none">
+                      <a:extLst>
+                        <a:ext uri="{96DAC541-7B7A-43D3-8B79-37D633B846F1}">
+                          <asvg:svgBlip xmlns:asvg="http://schemas.microsoft.com/office/drawing/2016/SVG/main" r:embed="rId9"/>
+                        </a:ext>
+                      </a:extLst>
+                    </a:blip>
                     <a:srcRect/>
                     <a:stretch>
                       <a:fillRect/>
@@ -3926,7 +3938,7 @@
           <wp:inline distT="0" distB="0" distL="0" distR="0">
             <wp:extent cx="5715000" cy="2524125"/>
             <wp:effectExtent t="0" r="0" b="0" l="0"/>
-            <wp:docPr id="1" name="figure-3-deployment-safety-boundary.png" descr="Deployment and machinery-safety boundary" title="Deployment and machinery-safety boundary"/>
+            <wp:docPr id="1" name="figure-3-deployment-safety-boundary.svg" descr="Deployment and machinery-safety boundary" title="Deployment and machinery-safety boundary"/>
             <wp:cNvGraphicFramePr>
               <a:graphicFrameLocks xmlns:a="http://schemas.openxmlformats.org/drawingml/2006/main" noChangeAspect="1"/>
             </wp:cNvGraphicFramePr>
@@ -3940,7 +3952,13 @@
                     </pic:cNvPicPr>
                   </pic:nvPicPr>
                   <pic:blipFill>
-                    <a:blip r:embed="rId9" cstate="none"/>
+                    <a:blip r:embed="rId12" cstate="none">
+                      <a:extLst>
+                        <a:ext uri="{96DAC541-7B7A-43D3-8B79-37D633B846F1}">
+                          <asvg:svgBlip xmlns:asvg="http://schemas.microsoft.com/office/drawing/2016/SVG/main" r:embed="rId11"/>
+                        </a:ext>
+                      </a:extLst>
+                    </a:blip>
                     <a:srcRect/>
                     <a:stretch>
                       <a:fillRect/>
@@ -4099,7 +4117,7 @@
           <wp:inline distT="0" distB="0" distL="0" distR="0">
             <wp:extent cx="5715000" cy="2428875"/>
             <wp:effectExtent t="0" r="0" b="0" l="0"/>
-            <wp:docPr id="1" name="figure-4-model-adaptation-lifecycle.png" descr="Model adaptation lifecycle" title="Model adaptation lifecycle"/>
+            <wp:docPr id="1" name="figure-4-model-adaptation-lifecycle.svg" descr="Model adaptation lifecycle" title="Model adaptation lifecycle"/>
             <wp:cNvGraphicFramePr>
               <a:graphicFrameLocks xmlns:a="http://schemas.openxmlformats.org/drawingml/2006/main" noChangeAspect="1"/>
             </wp:cNvGraphicFramePr>
@@ -4113,7 +4131,13 @@
                     </pic:cNvPicPr>
                   </pic:nvPicPr>
                   <pic:blipFill>
-                    <a:blip r:embed="rId10" cstate="none"/>
+                    <a:blip r:embed="rId14" cstate="none">
+                      <a:extLst>
+                        <a:ext uri="{96DAC541-7B7A-43D3-8B79-37D633B846F1}">
+                          <asvg:svgBlip xmlns:asvg="http://schemas.microsoft.com/office/drawing/2016/SVG/main" r:embed="rId13"/>
+                        </a:ext>
+                      </a:extLst>
+                    </a:blip>
                     <a:srcRect/>
                     <a:stretch>
                       <a:fillRect/>
@@ -4256,7 +4280,7 @@
           <wp:inline distT="0" distB="0" distL="0" distR="0">
             <wp:extent cx="5715000" cy="2667000"/>
             <wp:effectExtent t="0" r="0" b="0" l="0"/>
-            <wp:docPr id="1" name="figure-5-evaluation-evidence-workflow.png" descr="Evaluation and evidence workflow" title="Evaluation and evidence workflow"/>
+            <wp:docPr id="1" name="figure-5-evaluation-evidence-workflow.svg" descr="Evaluation and evidence workflow" title="Evaluation and evidence workflow"/>
             <wp:cNvGraphicFramePr>
               <a:graphicFrameLocks xmlns:a="http://schemas.openxmlformats.org/drawingml/2006/main" noChangeAspect="1"/>
             </wp:cNvGraphicFramePr>
@@ -4270,7 +4294,13 @@
                     </pic:cNvPicPr>
                   </pic:nvPicPr>
                   <pic:blipFill>
-                    <a:blip r:embed="rId11" cstate="none"/>
+                    <a:blip r:embed="rId16" cstate="none">
+                      <a:extLst>
+                        <a:ext uri="{96DAC541-7B7A-43D3-8B79-37D633B846F1}">
+                          <asvg:svgBlip xmlns:asvg="http://schemas.microsoft.com/office/drawing/2016/SVG/main" r:embed="rId15"/>
+                        </a:ext>
+                      </a:extLst>
+                    </a:blip>
                     <a:srcRect/>
                     <a:stretch>
                       <a:fillRect/>
@@ -10217,7 +10247,7 @@
           <wp:inline distT="0" distB="0" distL="0" distR="0">
             <wp:extent cx="5715000" cy="3000375"/>
             <wp:effectExtent t="0" r="0" b="0" l="0"/>
-            <wp:docPr id="1" name="figure-7-taco-confusions.png" descr="Top class-confusion pairs" title="Top class-confusion pairs"/>
+            <wp:docPr id="1" name="figure-6-taco-confusions.svg" descr="Top class-confusion pairs" title="Top class-confusion pairs"/>
             <wp:cNvGraphicFramePr>
               <a:graphicFrameLocks xmlns:a="http://schemas.openxmlformats.org/drawingml/2006/main" noChangeAspect="1"/>
             </wp:cNvGraphicFramePr>
@@ -10231,7 +10261,13 @@
                     </pic:cNvPicPr>
                   </pic:nvPicPr>
                   <pic:blipFill>
-                    <a:blip r:embed="rId12" cstate="none"/>
+                    <a:blip r:embed="rId18" cstate="none">
+                      <a:extLst>
+                        <a:ext uri="{96DAC541-7B7A-43D3-8B79-37D633B846F1}">
+                          <asvg:svgBlip xmlns:asvg="http://schemas.microsoft.com/office/drawing/2016/SVG/main" r:embed="rId17"/>
+                        </a:ext>
+                      </a:extLst>
+                    </a:blip>
                     <a:srcRect/>
                     <a:stretch>
                       <a:fillRect/>
@@ -10265,7 +10301,7 @@
           <w:sz w:val="18"/>
           <w:szCs w:val="18"/>
         </w:rPr>
-        <w:t xml:space="preserve">Figure 7. Top diagnostic class-confusion pairs after greedy all-class matching at IoU 0.50. An arrow denotes ground truth → prediction. The catch-all other_litter mapping dominates the largest pairs.</w:t>
+        <w:t xml:space="preserve">Figure 6. Top diagnostic class-confusion pairs after greedy all-class matching at IoU 0.50. An arrow denotes ground truth → prediction. The catch-all other_litter mapping dominates the largest pairs.</w:t>
       </w:r>
     </w:p>
     <w:p>
@@ -12781,7 +12817,7 @@
           <wp:inline distT="0" distB="0" distL="0" distR="0">
             <wp:extent cx="5715000" cy="2571750"/>
             <wp:effectExtent t="0" r="0" b="0" l="0"/>
-            <wp:docPr id="1" name="figure-6-jetson-latency-profile.png" descr="Jetson full-pipeline latency profile" title="Jetson full-pipeline latency profile"/>
+            <wp:docPr id="1" name="figure-7-jetson-latency-profile.svg" descr="Jetson full-pipeline latency profile" title="Jetson full-pipeline latency profile"/>
             <wp:cNvGraphicFramePr>
               <a:graphicFrameLocks xmlns:a="http://schemas.openxmlformats.org/drawingml/2006/main" noChangeAspect="1"/>
             </wp:cNvGraphicFramePr>
@@ -12795,7 +12831,13 @@
                     </pic:cNvPicPr>
                   </pic:nvPicPr>
                   <pic:blipFill>
-                    <a:blip r:embed="rId13" cstate="none"/>
+                    <a:blip r:embed="rId20" cstate="none">
+                      <a:extLst>
+                        <a:ext uri="{96DAC541-7B7A-43D3-8B79-37D633B846F1}">
+                          <asvg:svgBlip xmlns:asvg="http://schemas.microsoft.com/office/drawing/2016/SVG/main" r:embed="rId19"/>
+                        </a:ext>
+                      </a:extLst>
+                    </a:blip>
                     <a:srcRect/>
                     <a:stretch>
                       <a:fillRect/>
@@ -12829,7 +12871,7 @@
           <w:sz w:val="18"/>
           <w:szCs w:val="18"/>
         </w:rPr>
-        <w:t xml:space="preserve">Figure 6. Mean exclusive wall-time shares across three warmed Jetson full-pipeline runs. Model forward, detector preprocessing, and annotation output account for 95.38% of measured wall time.</w:t>
+        <w:t xml:space="preserve">Figure 7. Mean exclusive wall-time shares across three warmed Jetson full-pipeline runs. Model forward, detector preprocessing, and annotation output account for 95.38% of measured wall time.</w:t>
       </w:r>
     </w:p>
     <w:p>
@@ -14432,7 +14474,7 @@
         <w:jc w:val="both"/>
       </w:pPr>
       <w:r>
-        <w:t xml:space="preserve">[12] Liu, S., Zeng, Z., Ren, T., Li, F., Zhang, H., Yang, J., Jiang, Q., Li, C., Yang, J., Su, H., Zhu, J., &amp; Zhang, L. (2025). Grounding DINO: Marrying DINO with grounded pre-training for open-set object detection. In Computer Vision – ECCV 2024 (pp. 38–55). https://doi.org/10.1007/978-3-031-72970-6_3</w:t>
+        <w:t xml:space="preserve">[12] Liu, S., Zeng, Z., Ren, T., Li, F., Zhang, H., Yang, J., Jiang, Q., Li, C., Yang, J., Su, H., Zhu, J., &amp; Zhang, L. (2024). Grounding DINO: Marrying DINO with grounded pre-training for open-set object detection. In Computer Vision – ECCV 2024 (pp. 38–55). https://doi.org/10.1007/978-3-031-72970-6_3</w:t>
       </w:r>
     </w:p>
     <w:p>

</xml_diff>

<commit_message>
Verify and align preprint references
</commit_message>
<xml_diff>
--- a/paper/Edge_Litter_Detection_Preprint.docx
+++ b/paper/Edge_Litter_Detection_Preprint.docx
@@ -46,7 +46,7 @@
           <w:sz w:val="18"/>
           <w:szCs w:val="18"/>
         </w:rPr>
-        <w:t xml:space="preserve">Preprint version 1.6</w:t>
+        <w:t xml:space="preserve">Preprint version 1.7</w:t>
       </w:r>
     </w:p>
     <w:p>
@@ -424,7 +424,7 @@
         <w:jc w:val="both"/>
       </w:pPr>
       <w:r>
-        <w:t xml:space="preserve">TACO introduced a publicly available dataset of waste “in the wild,” with object annotations and a detailed material-oriented taxonomy [3]. It is useful for bootstrapping because it contains varied contexts rather than only controlled conveyor imagery. Studies based on TACO have also highlighted the difficulty of small objects, class imbalance, and the risk of reporting one aggregate metric without examining precision, recall, F1, object size, and scene conditions [4,5].</w:t>
+        <w:t xml:space="preserve">TACO introduced a publicly available dataset of waste “in the wild,” with object annotations and a detailed material-oriented taxonomy [3]. It is useful for bootstrapping because it contains varied contexts rather than only controlled conveyor imagery. A comparative TACO study highlighted the difficulty of small objects, class imbalance, and the risk of reporting one aggregate metric without examining precision, recall, F1, object size, and scene conditions [4]. Earlier street-waste systems separately demonstrated the practical task of localizing and classifying discarded objects in public scenes [5].</w:t>
       </w:r>
     </w:p>
     <w:p>
@@ -14420,7 +14420,7 @@
         <w:jc w:val="both"/>
       </w:pPr>
       <w:r>
-        <w:t xml:space="preserve">[6] Bashkirova, D., Abdelfattah, M., Zhu, Z., Akl, J., Alladkani, F., Hu, P., Ablavsky, V., Calli, B., Adel Bargal, S., &amp; Saenko, K. (2022). ZeroWaste dataset: Towards deformable object segmentation in cluttered scenes. In Proceedings of the IEEE/CVF Conference on Computer Vision and Pattern Recognition. https://doi.org/10.48550/arXiv.2106.02740</w:t>
+        <w:t xml:space="preserve">[6] Bashkirova, D., Abdelfattah, M., Zhu, Z., Akl, J., Alladkani, F., Hu, P., Ablavsky, V., Calli, B., Adel Bargal, S., &amp; Saenko, K. (2022). ZeroWaste dataset: Towards deformable object segmentation in cluttered scenes. In Proceedings of the IEEE/CVF Conference on Computer Vision and Pattern Recognition (pp. 21147–21157). https://openaccess.thecvf.com/content/CVPR2022/html/Bashkirova_ZeroWaste_Dataset_Towards_Deformable_Object_Segmentation_in_Cluttered_Scenes_CVPR_2022_paper.html</w:t>
       </w:r>
     </w:p>
     <w:p>
@@ -14438,7 +14438,7 @@
         <w:jc w:val="both"/>
       </w:pPr>
       <w:r>
-        <w:t xml:space="preserve">[8] Wu, T., Xu, Q., He, X., Weekes, O., Brown, J., &amp; Duan, W. (2026). RoLID-11K: A dashcam dataset for small-object roadside litter detection. arXiv:2601.00398. https://doi.org/10.48550/arXiv.2601.00398</w:t>
+        <w:t xml:space="preserve">[8] Wu, T., Xu, Q., He, X., Weekes, O., Brown, J., &amp; Duan, W. (2026). RoLID-11K: A dashcam dataset for small-object roadside litter detection. In Proceedings of the IEEE/CVF Winter Conference on Applications of Computer Vision Workshops (pp. 568–575). https://openaccess.thecvf.com/content/WACV2026W/WasteVision/html/Wu_RoLID-11K_A_Dashcam_Dataset_for_Small-Object_Roadside_Litter_Detection_WACVW_2026_paper.html</w:t>
       </w:r>
     </w:p>
     <w:p>
@@ -14465,7 +14465,7 @@
         <w:jc w:val="both"/>
       </w:pPr>
       <w:r>
-        <w:t xml:space="preserve">[11] Zhang, H., Li, F., Liu, S., Zhang, L., Su, H., Zhu, J., Ni, L. M., &amp; Shum, H.-Y. (2022). DINO: DETR with improved denoising anchor boxes for end-to-end object detection. arXiv:2203.03605. https://doi.org/10.48550/arXiv.2203.03605</w:t>
+        <w:t xml:space="preserve">[11] Zhang, H., Li, F., Liu, S., Zhang, L., Su, H., Zhu, J., Ni, L. M., &amp; Shum, H.-Y. (2023). DINO: DETR with improved denoising anchor boxes for end-to-end object detection. In International Conference on Learning Representations (ICLR 2023). https://openreview.net/forum?id=3mRwyG5one</w:t>
       </w:r>
     </w:p>
     <w:p>
@@ -14519,7 +14519,7 @@
         <w:jc w:val="both"/>
       </w:pPr>
       <w:r>
-        <w:t xml:space="preserve">[17] Paszke, A., Gross, S., Massa, F., Lerer, A., Bradbury, J., Chanan, G., Killeen, T., Lin, Z., Gimelshein, N., Antiga, L., et al. (2019). PyTorch: An imperative style, high-performance deep learning library. In Advances in Neural Information Processing Systems 32.</w:t>
+        <w:t xml:space="preserve">[17] Paszke, A., Gross, S., Massa, F., Lerer, A., Bradbury, J., Chanan, G., Killeen, T., Lin, Z., Gimelshein, N., Antiga, L., et al. (2019). PyTorch: An imperative style, high-performance deep learning library. In Advances in Neural Information Processing Systems 32 (pp. 8024–8035). https://proceedings.neurips.cc/paper/2019/hash/bdbca288fee7f92f2bfa9f7012727740-Abstract.html</w:t>
       </w:r>
     </w:p>
     <w:p>
@@ -14555,7 +14555,7 @@
         <w:jc w:val="both"/>
       </w:pPr>
       <w:r>
-        <w:t xml:space="preserve">[21] OWASP Foundation. (2021). Application Security Verification Standard 4.0.3. https://owasp.org/www-project-application-security-verification-standard/</w:t>
+        <w:t xml:space="preserve">[21] OWASP Foundation. (2025). Application Security Verification Standard 5.0.0. https://owasp.org/www-project-application-security-verification-standard/</w:t>
       </w:r>
     </w:p>
     <w:p>

</xml_diff>